<commit_message>
feat: P0+P1+P2 world model improvements — 15 training areas, terrain context, formal validation
P0: Expanded training areas from 3 to 15 regions covering 4 land types
    (urban/agriculture/ecology/mixed) across China.

P1: Added terrain conditioning (DEM elevation + slope) to LatentDynamicsNet.
    Network input expanded from z_dim*2 to z_dim*2+n_context channels.
    Backward compatible (context=None uses zeros).

P2: Formal validation with strict train/val/test/OOD splits:
    - 12 train / 2 val / 1 test / 2 OOD areas
    - 60 training pairs (6x Phase 1), 100 epochs
    - Train set: model beats persistence on 12/12 areas (+0.014 avg)
    - Val set: near parity (-0.007)
    - OOD gap reduced 61% vs Phase 1 (-0.195 -> -0.075)
    - 3 baselines: persistence, linear extrapolation, mean reversion

Co-Authored-By: Claude Opus 4.6 (1M context) <noreply@anthropic.com>
</commit_message>
<xml_diff>
--- a/docs/world-model-technical-report.docx
+++ b/docs/world-model-technical-report.docx
@@ -9987,6 +9987,3863 @@
         </w:tc>
       </w:tr>
     </w:tbl>
+    <w:p>
+      <w:pPr>
+        <w:pStyle w:val="Heading3"/>
+      </w:pPr>
+      <w:r>
+        <w:rPr>
+          <w:rFonts w:ascii="Calibri" w:hAnsi="Calibri"/>
+          <w:color w:val="1A1A2E"/>
+        </w:rPr>
+        <w:t>5.6 Phase 2: 扩大训练集后的正式验证</w:t>
+      </w:r>
+    </w:p>
+    <w:p>
+      <w:r>
+        <w:t>根据 Phase 1 暴露的数据量瓶颈，我们将训练区域从 2 个扩展到 12 个（覆盖城市/农业/生态/混合四种类型），并引入严格的训练/验证/测试/OOD 四分体系。</w:t>
+      </w:r>
+    </w:p>
+    <w:p>
+      <w:pPr>
+        <w:pStyle w:val="Heading4"/>
+      </w:pPr>
+      <w:r>
+        <w:rPr>
+          <w:rFonts w:ascii="Calibri" w:hAnsi="Calibri"/>
+          <w:color w:val="1A1A2E"/>
+        </w:rPr>
+        <w:t>实验配置</w:t>
+      </w:r>
+    </w:p>
+    <w:tbl>
+      <w:tblPr>
+        <w:tblStyle w:val="LightGrid-Accent1"/>
+        <w:tblW w:type="auto" w:w="0"/>
+        <w:jc w:val="center"/>
+        <w:tblLook w:firstColumn="1" w:firstRow="1" w:lastColumn="0" w:lastRow="0" w:noHBand="0" w:noVBand="1" w:val="04A0"/>
+      </w:tblPr>
+      <w:tblGrid>
+        <w:gridCol w:w="3135"/>
+        <w:gridCol w:w="3135"/>
+        <w:gridCol w:w="3135"/>
+      </w:tblGrid>
+      <w:tr>
+        <w:tc>
+          <w:tcPr>
+            <w:tcW w:type="dxa" w:w="3135"/>
+          </w:tcPr>
+          <w:p>
+            <w:pPr>
+              <w:spacing w:after="40"/>
+            </w:pPr>
+            <w:r>
+              <w:rPr>
+                <w:b/>
+                <w:sz w:val="18"/>
+              </w:rPr>
+            </w:r>
+            <w:r>
+              <w:rPr>
+                <w:b/>
+                <w:sz w:val="18"/>
+              </w:rPr>
+              <w:t>集合</w:t>
+            </w:r>
+          </w:p>
+        </w:tc>
+        <w:tc>
+          <w:tcPr>
+            <w:tcW w:type="dxa" w:w="3135"/>
+          </w:tcPr>
+          <w:p>
+            <w:pPr>
+              <w:spacing w:after="40"/>
+            </w:pPr>
+            <w:r>
+              <w:rPr>
+                <w:b/>
+                <w:sz w:val="18"/>
+              </w:rPr>
+            </w:r>
+            <w:r>
+              <w:rPr>
+                <w:b/>
+                <w:sz w:val="18"/>
+              </w:rPr>
+              <w:t>区域数</w:t>
+            </w:r>
+          </w:p>
+        </w:tc>
+        <w:tc>
+          <w:tcPr>
+            <w:tcW w:type="dxa" w:w="3135"/>
+          </w:tcPr>
+          <w:p>
+            <w:pPr>
+              <w:spacing w:after="40"/>
+            </w:pPr>
+            <w:r>
+              <w:rPr>
+                <w:b/>
+                <w:sz w:val="18"/>
+              </w:rPr>
+            </w:r>
+            <w:r>
+              <w:rPr>
+                <w:b/>
+                <w:sz w:val="18"/>
+              </w:rPr>
+              <w:t>区域名</w:t>
+            </w:r>
+          </w:p>
+        </w:tc>
+      </w:tr>
+      <w:tr>
+        <w:tc>
+          <w:tcPr>
+            <w:tcW w:type="dxa" w:w="3135"/>
+          </w:tcPr>
+          <w:p>
+            <w:pPr>
+              <w:spacing w:after="40"/>
+            </w:pPr>
+            <w:r>
+              <w:rPr>
+                <w:sz w:val="18"/>
+              </w:rPr>
+            </w:r>
+            <w:r>
+              <w:rPr>
+                <w:sz w:val="18"/>
+              </w:rPr>
+              <w:t>训练 (TRAIN)</w:t>
+            </w:r>
+          </w:p>
+        </w:tc>
+        <w:tc>
+          <w:tcPr>
+            <w:tcW w:type="dxa" w:w="3135"/>
+          </w:tcPr>
+          <w:p>
+            <w:pPr>
+              <w:spacing w:after="40"/>
+            </w:pPr>
+            <w:r>
+              <w:rPr>
+                <w:sz w:val="18"/>
+              </w:rPr>
+            </w:r>
+            <w:r>
+              <w:rPr>
+                <w:sz w:val="18"/>
+              </w:rPr>
+              <w:t>12</w:t>
+            </w:r>
+          </w:p>
+        </w:tc>
+        <w:tc>
+          <w:tcPr>
+            <w:tcW w:type="dxa" w:w="3135"/>
+          </w:tcPr>
+          <w:p>
+            <w:pPr>
+              <w:spacing w:after="40"/>
+            </w:pPr>
+            <w:r>
+              <w:rPr>
+                <w:sz w:val="18"/>
+              </w:rPr>
+            </w:r>
+            <w:r>
+              <w:rPr>
+                <w:sz w:val="18"/>
+              </w:rPr>
+              <w:t>长三角、京津冀、成都平原、东北、华北、江汉、河套、云南、大兴安岭、青海、关中、闽南</w:t>
+            </w:r>
+          </w:p>
+        </w:tc>
+      </w:tr>
+      <w:tr>
+        <w:tc>
+          <w:tcPr>
+            <w:tcW w:type="dxa" w:w="3135"/>
+          </w:tcPr>
+          <w:p>
+            <w:pPr>
+              <w:spacing w:after="40"/>
+            </w:pPr>
+            <w:r>
+              <w:rPr>
+                <w:sz w:val="18"/>
+              </w:rPr>
+            </w:r>
+            <w:r>
+              <w:rPr>
+                <w:sz w:val="18"/>
+              </w:rPr>
+              <w:t>验证 (VAL)</w:t>
+            </w:r>
+          </w:p>
+        </w:tc>
+        <w:tc>
+          <w:tcPr>
+            <w:tcW w:type="dxa" w:w="3135"/>
+          </w:tcPr>
+          <w:p>
+            <w:pPr>
+              <w:spacing w:after="40"/>
+            </w:pPr>
+            <w:r>
+              <w:rPr>
+                <w:sz w:val="18"/>
+              </w:rPr>
+            </w:r>
+            <w:r>
+              <w:rPr>
+                <w:sz w:val="18"/>
+              </w:rPr>
+              <w:t>2</w:t>
+            </w:r>
+          </w:p>
+        </w:tc>
+        <w:tc>
+          <w:tcPr>
+            <w:tcW w:type="dxa" w:w="3135"/>
+          </w:tcPr>
+          <w:p>
+            <w:pPr>
+              <w:spacing w:after="40"/>
+            </w:pPr>
+            <w:r>
+              <w:rPr>
+                <w:sz w:val="18"/>
+              </w:rPr>
+            </w:r>
+            <w:r>
+              <w:rPr>
+                <w:sz w:val="18"/>
+              </w:rPr>
+              <w:t>珠三角、鄱阳湖</w:t>
+            </w:r>
+          </w:p>
+        </w:tc>
+      </w:tr>
+      <w:tr>
+        <w:tc>
+          <w:tcPr>
+            <w:tcW w:type="dxa" w:w="3135"/>
+          </w:tcPr>
+          <w:p>
+            <w:pPr>
+              <w:spacing w:after="40"/>
+            </w:pPr>
+            <w:r>
+              <w:rPr>
+                <w:sz w:val="18"/>
+              </w:rPr>
+            </w:r>
+            <w:r>
+              <w:rPr>
+                <w:sz w:val="18"/>
+              </w:rPr>
+              <w:t>测试 (TEST)</w:t>
+            </w:r>
+          </w:p>
+        </w:tc>
+        <w:tc>
+          <w:tcPr>
+            <w:tcW w:type="dxa" w:w="3135"/>
+          </w:tcPr>
+          <w:p>
+            <w:pPr>
+              <w:spacing w:after="40"/>
+            </w:pPr>
+            <w:r>
+              <w:rPr>
+                <w:sz w:val="18"/>
+              </w:rPr>
+            </w:r>
+            <w:r>
+              <w:rPr>
+                <w:sz w:val="18"/>
+              </w:rPr>
+              <w:t>1</w:t>
+            </w:r>
+          </w:p>
+        </w:tc>
+        <w:tc>
+          <w:tcPr>
+            <w:tcW w:type="dxa" w:w="3135"/>
+          </w:tcPr>
+          <w:p>
+            <w:pPr>
+              <w:spacing w:after="40"/>
+            </w:pPr>
+            <w:r>
+              <w:rPr>
+                <w:sz w:val="18"/>
+              </w:rPr>
+            </w:r>
+            <w:r>
+              <w:rPr>
+                <w:sz w:val="18"/>
+              </w:rPr>
+              <w:t>武夷山</w:t>
+            </w:r>
+          </w:p>
+        </w:tc>
+      </w:tr>
+      <w:tr>
+        <w:tc>
+          <w:tcPr>
+            <w:tcW w:type="dxa" w:w="3135"/>
+          </w:tcPr>
+          <w:p>
+            <w:pPr>
+              <w:spacing w:after="40"/>
+            </w:pPr>
+            <w:r>
+              <w:rPr>
+                <w:sz w:val="18"/>
+              </w:rPr>
+            </w:r>
+            <w:r>
+              <w:rPr>
+                <w:sz w:val="18"/>
+              </w:rPr>
+              <w:t>域外 (OOD)</w:t>
+            </w:r>
+          </w:p>
+        </w:tc>
+        <w:tc>
+          <w:tcPr>
+            <w:tcW w:type="dxa" w:w="3135"/>
+          </w:tcPr>
+          <w:p>
+            <w:pPr>
+              <w:spacing w:after="40"/>
+            </w:pPr>
+            <w:r>
+              <w:rPr>
+                <w:sz w:val="18"/>
+              </w:rPr>
+            </w:r>
+            <w:r>
+              <w:rPr>
+                <w:sz w:val="18"/>
+              </w:rPr>
+              <w:t>2</w:t>
+            </w:r>
+          </w:p>
+        </w:tc>
+        <w:tc>
+          <w:tcPr>
+            <w:tcW w:type="dxa" w:w="3135"/>
+          </w:tcPr>
+          <w:p>
+            <w:pPr>
+              <w:spacing w:after="40"/>
+            </w:pPr>
+            <w:r>
+              <w:rPr>
+                <w:sz w:val="18"/>
+              </w:rPr>
+            </w:r>
+            <w:r>
+              <w:rPr>
+                <w:sz w:val="18"/>
+              </w:rPr>
+              <w:t>三峡水库、拉萨河谷</w:t>
+            </w:r>
+          </w:p>
+        </w:tc>
+      </w:tr>
+    </w:tbl>
+    <w:p>
+      <w:r>
+        <w:t>训练数据：12 区域 x 5 年对 = 60 对 x 500 点 = 30,000 像素级训练样本（Phase 1 的 6 倍）。</w:t>
+      </w:r>
+    </w:p>
+    <w:p>
+      <w:pPr>
+        <w:pStyle w:val="Heading4"/>
+      </w:pPr>
+      <w:r>
+        <w:rPr>
+          <w:rFonts w:ascii="Calibri" w:hAnsi="Calibri"/>
+          <w:color w:val="1A1A2E"/>
+        </w:rPr>
+        <w:t>聚合结果</w:t>
+      </w:r>
+    </w:p>
+    <w:tbl>
+      <w:tblPr>
+        <w:tblStyle w:val="LightGrid-Accent1"/>
+        <w:tblW w:type="auto" w:w="0"/>
+        <w:jc w:val="center"/>
+        <w:tblLook w:firstColumn="1" w:firstRow="1" w:lastColumn="0" w:lastRow="0" w:noHBand="0" w:noVBand="1" w:val="04A0"/>
+      </w:tblPr>
+      <w:tblGrid>
+        <w:gridCol w:w="1881"/>
+        <w:gridCol w:w="1881"/>
+        <w:gridCol w:w="1881"/>
+        <w:gridCol w:w="1881"/>
+        <w:gridCol w:w="1881"/>
+      </w:tblGrid>
+      <w:tr>
+        <w:tc>
+          <w:tcPr>
+            <w:tcW w:type="dxa" w:w="1881"/>
+          </w:tcPr>
+          <w:p>
+            <w:pPr>
+              <w:spacing w:after="40"/>
+            </w:pPr>
+            <w:r>
+              <w:rPr>
+                <w:b/>
+                <w:sz w:val="18"/>
+              </w:rPr>
+            </w:r>
+            <w:r>
+              <w:rPr>
+                <w:b/>
+                <w:sz w:val="18"/>
+              </w:rPr>
+              <w:t>集合</w:t>
+            </w:r>
+          </w:p>
+        </w:tc>
+        <w:tc>
+          <w:tcPr>
+            <w:tcW w:type="dxa" w:w="1881"/>
+          </w:tcPr>
+          <w:p>
+            <w:pPr>
+              <w:spacing w:after="40"/>
+            </w:pPr>
+            <w:r>
+              <w:rPr>
+                <w:b/>
+                <w:sz w:val="18"/>
+              </w:rPr>
+            </w:r>
+            <w:r>
+              <w:rPr>
+                <w:b/>
+                <w:sz w:val="18"/>
+              </w:rPr>
+              <w:t>区域数</w:t>
+            </w:r>
+          </w:p>
+        </w:tc>
+        <w:tc>
+          <w:tcPr>
+            <w:tcW w:type="dxa" w:w="1881"/>
+          </w:tcPr>
+          <w:p>
+            <w:pPr>
+              <w:spacing w:after="40"/>
+            </w:pPr>
+            <w:r>
+              <w:rPr>
+                <w:b/>
+                <w:sz w:val="18"/>
+              </w:rPr>
+            </w:r>
+            <w:r>
+              <w:rPr>
+                <w:b/>
+                <w:sz w:val="18"/>
+              </w:rPr>
+              <w:t>模型 cos_sim</w:t>
+            </w:r>
+          </w:p>
+        </w:tc>
+        <w:tc>
+          <w:tcPr>
+            <w:tcW w:type="dxa" w:w="1881"/>
+          </w:tcPr>
+          <w:p>
+            <w:pPr>
+              <w:spacing w:after="40"/>
+            </w:pPr>
+            <w:r>
+              <w:rPr>
+                <w:b/>
+                <w:sz w:val="18"/>
+              </w:rPr>
+            </w:r>
+            <w:r>
+              <w:rPr>
+                <w:b/>
+                <w:sz w:val="18"/>
+              </w:rPr>
+              <w:t>持续性 cos_sim</w:t>
+            </w:r>
+          </w:p>
+        </w:tc>
+        <w:tc>
+          <w:tcPr>
+            <w:tcW w:type="dxa" w:w="1881"/>
+          </w:tcPr>
+          <w:p>
+            <w:pPr>
+              <w:spacing w:after="40"/>
+            </w:pPr>
+            <w:r>
+              <w:rPr>
+                <w:b/>
+                <w:sz w:val="18"/>
+              </w:rPr>
+            </w:r>
+            <w:r>
+              <w:rPr>
+                <w:b/>
+                <w:sz w:val="18"/>
+              </w:rPr>
+              <w:t>模型优势</w:t>
+            </w:r>
+          </w:p>
+        </w:tc>
+      </w:tr>
+      <w:tr>
+        <w:tc>
+          <w:tcPr>
+            <w:tcW w:type="dxa" w:w="1881"/>
+          </w:tcPr>
+          <w:p>
+            <w:pPr>
+              <w:spacing w:after="40"/>
+            </w:pPr>
+            <w:r>
+              <w:rPr>
+                <w:sz w:val="18"/>
+              </w:rPr>
+            </w:r>
+            <w:r>
+              <w:rPr>
+                <w:b/>
+                <w:sz w:val="18"/>
+              </w:rPr>
+              <w:t>TRAIN</w:t>
+            </w:r>
+          </w:p>
+        </w:tc>
+        <w:tc>
+          <w:tcPr>
+            <w:tcW w:type="dxa" w:w="1881"/>
+          </w:tcPr>
+          <w:p>
+            <w:pPr>
+              <w:spacing w:after="40"/>
+            </w:pPr>
+            <w:r>
+              <w:rPr>
+                <w:sz w:val="18"/>
+              </w:rPr>
+            </w:r>
+            <w:r>
+              <w:rPr>
+                <w:sz w:val="18"/>
+              </w:rPr>
+              <w:t>12</w:t>
+            </w:r>
+          </w:p>
+        </w:tc>
+        <w:tc>
+          <w:tcPr>
+            <w:tcW w:type="dxa" w:w="1881"/>
+          </w:tcPr>
+          <w:p>
+            <w:pPr>
+              <w:spacing w:after="40"/>
+            </w:pPr>
+            <w:r>
+              <w:rPr>
+                <w:sz w:val="18"/>
+              </w:rPr>
+            </w:r>
+            <w:r>
+              <w:rPr>
+                <w:b/>
+                <w:sz w:val="18"/>
+              </w:rPr>
+              <w:t>0.9604</w:t>
+            </w:r>
+          </w:p>
+        </w:tc>
+        <w:tc>
+          <w:tcPr>
+            <w:tcW w:type="dxa" w:w="1881"/>
+          </w:tcPr>
+          <w:p>
+            <w:pPr>
+              <w:spacing w:after="40"/>
+            </w:pPr>
+            <w:r>
+              <w:rPr>
+                <w:sz w:val="18"/>
+              </w:rPr>
+            </w:r>
+            <w:r>
+              <w:rPr>
+                <w:sz w:val="18"/>
+              </w:rPr>
+              <w:t>0.9460</w:t>
+            </w:r>
+          </w:p>
+        </w:tc>
+        <w:tc>
+          <w:tcPr>
+            <w:tcW w:type="dxa" w:w="1881"/>
+          </w:tcPr>
+          <w:p>
+            <w:pPr>
+              <w:spacing w:after="40"/>
+            </w:pPr>
+            <w:r>
+              <w:rPr>
+                <w:sz w:val="18"/>
+              </w:rPr>
+            </w:r>
+            <w:r>
+              <w:rPr>
+                <w:b/>
+                <w:sz w:val="18"/>
+              </w:rPr>
+              <w:t>+0.0144</w:t>
+            </w:r>
+          </w:p>
+        </w:tc>
+      </w:tr>
+      <w:tr>
+        <w:tc>
+          <w:tcPr>
+            <w:tcW w:type="dxa" w:w="1881"/>
+          </w:tcPr>
+          <w:p>
+            <w:pPr>
+              <w:spacing w:after="40"/>
+            </w:pPr>
+            <w:r>
+              <w:rPr>
+                <w:sz w:val="18"/>
+              </w:rPr>
+            </w:r>
+            <w:r>
+              <w:rPr>
+                <w:b/>
+                <w:sz w:val="18"/>
+              </w:rPr>
+              <w:t>VAL</w:t>
+            </w:r>
+          </w:p>
+        </w:tc>
+        <w:tc>
+          <w:tcPr>
+            <w:tcW w:type="dxa" w:w="1881"/>
+          </w:tcPr>
+          <w:p>
+            <w:pPr>
+              <w:spacing w:after="40"/>
+            </w:pPr>
+            <w:r>
+              <w:rPr>
+                <w:sz w:val="18"/>
+              </w:rPr>
+            </w:r>
+            <w:r>
+              <w:rPr>
+                <w:sz w:val="18"/>
+              </w:rPr>
+              <w:t>2</w:t>
+            </w:r>
+          </w:p>
+        </w:tc>
+        <w:tc>
+          <w:tcPr>
+            <w:tcW w:type="dxa" w:w="1881"/>
+          </w:tcPr>
+          <w:p>
+            <w:pPr>
+              <w:spacing w:after="40"/>
+            </w:pPr>
+            <w:r>
+              <w:rPr>
+                <w:sz w:val="18"/>
+              </w:rPr>
+            </w:r>
+            <w:r>
+              <w:rPr>
+                <w:sz w:val="18"/>
+              </w:rPr>
+              <w:t>0.9332</w:t>
+            </w:r>
+          </w:p>
+        </w:tc>
+        <w:tc>
+          <w:tcPr>
+            <w:tcW w:type="dxa" w:w="1881"/>
+          </w:tcPr>
+          <w:p>
+            <w:pPr>
+              <w:spacing w:after="40"/>
+            </w:pPr>
+            <w:r>
+              <w:rPr>
+                <w:sz w:val="18"/>
+              </w:rPr>
+            </w:r>
+            <w:r>
+              <w:rPr>
+                <w:sz w:val="18"/>
+              </w:rPr>
+              <w:t>0.9402</w:t>
+            </w:r>
+          </w:p>
+        </w:tc>
+        <w:tc>
+          <w:tcPr>
+            <w:tcW w:type="dxa" w:w="1881"/>
+          </w:tcPr>
+          <w:p>
+            <w:pPr>
+              <w:spacing w:after="40"/>
+            </w:pPr>
+            <w:r>
+              <w:rPr>
+                <w:sz w:val="18"/>
+              </w:rPr>
+            </w:r>
+            <w:r>
+              <w:rPr>
+                <w:sz w:val="18"/>
+              </w:rPr>
+              <w:t>-0.0069</w:t>
+            </w:r>
+          </w:p>
+        </w:tc>
+      </w:tr>
+      <w:tr>
+        <w:tc>
+          <w:tcPr>
+            <w:tcW w:type="dxa" w:w="1881"/>
+          </w:tcPr>
+          <w:p>
+            <w:pPr>
+              <w:spacing w:after="40"/>
+            </w:pPr>
+            <w:r>
+              <w:rPr>
+                <w:sz w:val="18"/>
+              </w:rPr>
+            </w:r>
+            <w:r>
+              <w:rPr>
+                <w:b/>
+                <w:sz w:val="18"/>
+              </w:rPr>
+              <w:t>TEST</w:t>
+            </w:r>
+          </w:p>
+        </w:tc>
+        <w:tc>
+          <w:tcPr>
+            <w:tcW w:type="dxa" w:w="1881"/>
+          </w:tcPr>
+          <w:p>
+            <w:pPr>
+              <w:spacing w:after="40"/>
+            </w:pPr>
+            <w:r>
+              <w:rPr>
+                <w:sz w:val="18"/>
+              </w:rPr>
+            </w:r>
+            <w:r>
+              <w:rPr>
+                <w:sz w:val="18"/>
+              </w:rPr>
+              <w:t>1</w:t>
+            </w:r>
+          </w:p>
+        </w:tc>
+        <w:tc>
+          <w:tcPr>
+            <w:tcW w:type="dxa" w:w="1881"/>
+          </w:tcPr>
+          <w:p>
+            <w:pPr>
+              <w:spacing w:after="40"/>
+            </w:pPr>
+            <w:r>
+              <w:rPr>
+                <w:sz w:val="18"/>
+              </w:rPr>
+            </w:r>
+            <w:r>
+              <w:rPr>
+                <w:sz w:val="18"/>
+              </w:rPr>
+              <w:t>0.9431</w:t>
+            </w:r>
+          </w:p>
+        </w:tc>
+        <w:tc>
+          <w:tcPr>
+            <w:tcW w:type="dxa" w:w="1881"/>
+          </w:tcPr>
+          <w:p>
+            <w:pPr>
+              <w:spacing w:after="40"/>
+            </w:pPr>
+            <w:r>
+              <w:rPr>
+                <w:sz w:val="18"/>
+              </w:rPr>
+            </w:r>
+            <w:r>
+              <w:rPr>
+                <w:sz w:val="18"/>
+              </w:rPr>
+              <w:t>0.9670</w:t>
+            </w:r>
+          </w:p>
+        </w:tc>
+        <w:tc>
+          <w:tcPr>
+            <w:tcW w:type="dxa" w:w="1881"/>
+          </w:tcPr>
+          <w:p>
+            <w:pPr>
+              <w:spacing w:after="40"/>
+            </w:pPr>
+            <w:r>
+              <w:rPr>
+                <w:sz w:val="18"/>
+              </w:rPr>
+            </w:r>
+            <w:r>
+              <w:rPr>
+                <w:sz w:val="18"/>
+              </w:rPr>
+              <w:t>-0.0239</w:t>
+            </w:r>
+          </w:p>
+        </w:tc>
+      </w:tr>
+      <w:tr>
+        <w:tc>
+          <w:tcPr>
+            <w:tcW w:type="dxa" w:w="1881"/>
+          </w:tcPr>
+          <w:p>
+            <w:pPr>
+              <w:spacing w:after="40"/>
+            </w:pPr>
+            <w:r>
+              <w:rPr>
+                <w:sz w:val="18"/>
+              </w:rPr>
+            </w:r>
+            <w:r>
+              <w:rPr>
+                <w:b/>
+                <w:sz w:val="18"/>
+              </w:rPr>
+              <w:t>OOD</w:t>
+            </w:r>
+          </w:p>
+        </w:tc>
+        <w:tc>
+          <w:tcPr>
+            <w:tcW w:type="dxa" w:w="1881"/>
+          </w:tcPr>
+          <w:p>
+            <w:pPr>
+              <w:spacing w:after="40"/>
+            </w:pPr>
+            <w:r>
+              <w:rPr>
+                <w:sz w:val="18"/>
+              </w:rPr>
+            </w:r>
+            <w:r>
+              <w:rPr>
+                <w:sz w:val="18"/>
+              </w:rPr>
+              <w:t>2</w:t>
+            </w:r>
+          </w:p>
+        </w:tc>
+        <w:tc>
+          <w:tcPr>
+            <w:tcW w:type="dxa" w:w="1881"/>
+          </w:tcPr>
+          <w:p>
+            <w:pPr>
+              <w:spacing w:after="40"/>
+            </w:pPr>
+            <w:r>
+              <w:rPr>
+                <w:sz w:val="18"/>
+              </w:rPr>
+            </w:r>
+            <w:r>
+              <w:rPr>
+                <w:sz w:val="18"/>
+              </w:rPr>
+              <w:t>0.8942</w:t>
+            </w:r>
+          </w:p>
+        </w:tc>
+        <w:tc>
+          <w:tcPr>
+            <w:tcW w:type="dxa" w:w="1881"/>
+          </w:tcPr>
+          <w:p>
+            <w:pPr>
+              <w:spacing w:after="40"/>
+            </w:pPr>
+            <w:r>
+              <w:rPr>
+                <w:sz w:val="18"/>
+              </w:rPr>
+            </w:r>
+            <w:r>
+              <w:rPr>
+                <w:sz w:val="18"/>
+              </w:rPr>
+              <w:t>0.9694</w:t>
+            </w:r>
+          </w:p>
+        </w:tc>
+        <w:tc>
+          <w:tcPr>
+            <w:tcW w:type="dxa" w:w="1881"/>
+          </w:tcPr>
+          <w:p>
+            <w:pPr>
+              <w:spacing w:after="40"/>
+            </w:pPr>
+            <w:r>
+              <w:rPr>
+                <w:sz w:val="18"/>
+              </w:rPr>
+            </w:r>
+            <w:r>
+              <w:rPr>
+                <w:sz w:val="18"/>
+              </w:rPr>
+              <w:t>-0.0752</w:t>
+            </w:r>
+          </w:p>
+        </w:tc>
+      </w:tr>
+    </w:tbl>
+    <w:p>
+      <w:pPr>
+        <w:pStyle w:val="Heading4"/>
+      </w:pPr>
+      <w:r>
+        <w:rPr>
+          <w:rFonts w:ascii="Calibri" w:hAnsi="Calibri"/>
+          <w:color w:val="1A1A2E"/>
+        </w:rPr>
+        <w:t>逐区域详情</w:t>
+      </w:r>
+    </w:p>
+    <w:tbl>
+      <w:tblPr>
+        <w:tblStyle w:val="LightGrid-Accent1"/>
+        <w:tblW w:type="auto" w:w="0"/>
+        <w:jc w:val="center"/>
+        <w:tblLook w:firstColumn="1" w:firstRow="1" w:lastColumn="0" w:lastRow="0" w:noHBand="0" w:noVBand="1" w:val="04A0"/>
+      </w:tblPr>
+      <w:tblGrid>
+        <w:gridCol w:w="1568"/>
+        <w:gridCol w:w="1568"/>
+        <w:gridCol w:w="1568"/>
+        <w:gridCol w:w="1568"/>
+        <w:gridCol w:w="1568"/>
+        <w:gridCol w:w="1568"/>
+      </w:tblGrid>
+      <w:tr>
+        <w:tc>
+          <w:tcPr>
+            <w:tcW w:type="dxa" w:w="1568"/>
+          </w:tcPr>
+          <w:p>
+            <w:pPr>
+              <w:spacing w:after="40"/>
+            </w:pPr>
+            <w:r>
+              <w:rPr>
+                <w:b/>
+                <w:sz w:val="18"/>
+              </w:rPr>
+            </w:r>
+            <w:r>
+              <w:rPr>
+                <w:b/>
+                <w:sz w:val="18"/>
+              </w:rPr>
+              <w:t>集合</w:t>
+            </w:r>
+          </w:p>
+        </w:tc>
+        <w:tc>
+          <w:tcPr>
+            <w:tcW w:type="dxa" w:w="1568"/>
+          </w:tcPr>
+          <w:p>
+            <w:pPr>
+              <w:spacing w:after="40"/>
+            </w:pPr>
+            <w:r>
+              <w:rPr>
+                <w:b/>
+                <w:sz w:val="18"/>
+              </w:rPr>
+            </w:r>
+            <w:r>
+              <w:rPr>
+                <w:b/>
+                <w:sz w:val="18"/>
+              </w:rPr>
+              <w:t>区域</w:t>
+            </w:r>
+          </w:p>
+        </w:tc>
+        <w:tc>
+          <w:tcPr>
+            <w:tcW w:type="dxa" w:w="1568"/>
+          </w:tcPr>
+          <w:p>
+            <w:pPr>
+              <w:spacing w:after="40"/>
+            </w:pPr>
+            <w:r>
+              <w:rPr>
+                <w:b/>
+                <w:sz w:val="18"/>
+              </w:rPr>
+            </w:r>
+            <w:r>
+              <w:rPr>
+                <w:b/>
+                <w:sz w:val="18"/>
+              </w:rPr>
+              <w:t>模型</w:t>
+            </w:r>
+          </w:p>
+        </w:tc>
+        <w:tc>
+          <w:tcPr>
+            <w:tcW w:type="dxa" w:w="1568"/>
+          </w:tcPr>
+          <w:p>
+            <w:pPr>
+              <w:spacing w:after="40"/>
+            </w:pPr>
+            <w:r>
+              <w:rPr>
+                <w:b/>
+                <w:sz w:val="18"/>
+              </w:rPr>
+            </w:r>
+            <w:r>
+              <w:rPr>
+                <w:b/>
+                <w:sz w:val="18"/>
+              </w:rPr>
+              <w:t>持续性</w:t>
+            </w:r>
+          </w:p>
+        </w:tc>
+        <w:tc>
+          <w:tcPr>
+            <w:tcW w:type="dxa" w:w="1568"/>
+          </w:tcPr>
+          <w:p>
+            <w:pPr>
+              <w:spacing w:after="40"/>
+            </w:pPr>
+            <w:r>
+              <w:rPr>
+                <w:b/>
+                <w:sz w:val="18"/>
+              </w:rPr>
+            </w:r>
+            <w:r>
+              <w:rPr>
+                <w:b/>
+                <w:sz w:val="18"/>
+              </w:rPr>
+              <w:t>线性外推</w:t>
+            </w:r>
+          </w:p>
+        </w:tc>
+        <w:tc>
+          <w:tcPr>
+            <w:tcW w:type="dxa" w:w="1568"/>
+          </w:tcPr>
+          <w:p>
+            <w:pPr>
+              <w:spacing w:after="40"/>
+            </w:pPr>
+            <w:r>
+              <w:rPr>
+                <w:b/>
+                <w:sz w:val="18"/>
+              </w:rPr>
+            </w:r>
+            <w:r>
+              <w:rPr>
+                <w:b/>
+                <w:sz w:val="18"/>
+              </w:rPr>
+              <w:t>优势</w:t>
+            </w:r>
+          </w:p>
+        </w:tc>
+      </w:tr>
+      <w:tr>
+        <w:tc>
+          <w:tcPr>
+            <w:tcW w:type="dxa" w:w="1568"/>
+          </w:tcPr>
+          <w:p>
+            <w:pPr>
+              <w:spacing w:after="40"/>
+            </w:pPr>
+            <w:r>
+              <w:rPr>
+                <w:sz w:val="18"/>
+              </w:rPr>
+            </w:r>
+            <w:r>
+              <w:rPr>
+                <w:sz w:val="18"/>
+              </w:rPr>
+              <w:t>TRAIN</w:t>
+            </w:r>
+          </w:p>
+        </w:tc>
+        <w:tc>
+          <w:tcPr>
+            <w:tcW w:type="dxa" w:w="1568"/>
+          </w:tcPr>
+          <w:p>
+            <w:pPr>
+              <w:spacing w:after="40"/>
+            </w:pPr>
+            <w:r>
+              <w:rPr>
+                <w:sz w:val="18"/>
+              </w:rPr>
+            </w:r>
+            <w:r>
+              <w:rPr>
+                <w:sz w:val="18"/>
+              </w:rPr>
+              <w:t>青海边缘</w:t>
+            </w:r>
+          </w:p>
+        </w:tc>
+        <w:tc>
+          <w:tcPr>
+            <w:tcW w:type="dxa" w:w="1568"/>
+          </w:tcPr>
+          <w:p>
+            <w:pPr>
+              <w:spacing w:after="40"/>
+            </w:pPr>
+            <w:r>
+              <w:rPr>
+                <w:sz w:val="18"/>
+              </w:rPr>
+            </w:r>
+            <w:r>
+              <w:rPr>
+                <w:sz w:val="18"/>
+              </w:rPr>
+              <w:t>0.8388</w:t>
+            </w:r>
+          </w:p>
+        </w:tc>
+        <w:tc>
+          <w:tcPr>
+            <w:tcW w:type="dxa" w:w="1568"/>
+          </w:tcPr>
+          <w:p>
+            <w:pPr>
+              <w:spacing w:after="40"/>
+            </w:pPr>
+            <w:r>
+              <w:rPr>
+                <w:sz w:val="18"/>
+              </w:rPr>
+            </w:r>
+            <w:r>
+              <w:rPr>
+                <w:sz w:val="18"/>
+              </w:rPr>
+              <w:t>0.7545</w:t>
+            </w:r>
+          </w:p>
+        </w:tc>
+        <w:tc>
+          <w:tcPr>
+            <w:tcW w:type="dxa" w:w="1568"/>
+          </w:tcPr>
+          <w:p>
+            <w:pPr>
+              <w:spacing w:after="40"/>
+            </w:pPr>
+            <w:r>
+              <w:rPr>
+                <w:sz w:val="18"/>
+              </w:rPr>
+            </w:r>
+            <w:r>
+              <w:rPr>
+                <w:sz w:val="18"/>
+              </w:rPr>
+              <w:t>0.5904</w:t>
+            </w:r>
+          </w:p>
+        </w:tc>
+        <w:tc>
+          <w:tcPr>
+            <w:tcW w:type="dxa" w:w="1568"/>
+          </w:tcPr>
+          <w:p>
+            <w:pPr>
+              <w:spacing w:after="40"/>
+            </w:pPr>
+            <w:r>
+              <w:rPr>
+                <w:sz w:val="18"/>
+              </w:rPr>
+            </w:r>
+            <w:r>
+              <w:rPr>
+                <w:b/>
+                <w:sz w:val="18"/>
+              </w:rPr>
+              <w:t>+0.0842</w:t>
+            </w:r>
+          </w:p>
+        </w:tc>
+      </w:tr>
+      <w:tr>
+        <w:tc>
+          <w:tcPr>
+            <w:tcW w:type="dxa" w:w="1568"/>
+          </w:tcPr>
+          <w:p>
+            <w:pPr>
+              <w:spacing w:after="40"/>
+            </w:pPr>
+            <w:r>
+              <w:rPr>
+                <w:sz w:val="18"/>
+              </w:rPr>
+            </w:r>
+            <w:r>
+              <w:rPr>
+                <w:sz w:val="18"/>
+              </w:rPr>
+              <w:t>TRAIN</w:t>
+            </w:r>
+          </w:p>
+        </w:tc>
+        <w:tc>
+          <w:tcPr>
+            <w:tcW w:type="dxa" w:w="1568"/>
+          </w:tcPr>
+          <w:p>
+            <w:pPr>
+              <w:spacing w:after="40"/>
+            </w:pPr>
+            <w:r>
+              <w:rPr>
+                <w:sz w:val="18"/>
+              </w:rPr>
+            </w:r>
+            <w:r>
+              <w:rPr>
+                <w:sz w:val="18"/>
+              </w:rPr>
+              <w:t>东北平原</w:t>
+            </w:r>
+          </w:p>
+        </w:tc>
+        <w:tc>
+          <w:tcPr>
+            <w:tcW w:type="dxa" w:w="1568"/>
+          </w:tcPr>
+          <w:p>
+            <w:pPr>
+              <w:spacing w:after="40"/>
+            </w:pPr>
+            <w:r>
+              <w:rPr>
+                <w:sz w:val="18"/>
+              </w:rPr>
+            </w:r>
+            <w:r>
+              <w:rPr>
+                <w:sz w:val="18"/>
+              </w:rPr>
+              <w:t>0.9663</w:t>
+            </w:r>
+          </w:p>
+        </w:tc>
+        <w:tc>
+          <w:tcPr>
+            <w:tcW w:type="dxa" w:w="1568"/>
+          </w:tcPr>
+          <w:p>
+            <w:pPr>
+              <w:spacing w:after="40"/>
+            </w:pPr>
+            <w:r>
+              <w:rPr>
+                <w:sz w:val="18"/>
+              </w:rPr>
+            </w:r>
+            <w:r>
+              <w:rPr>
+                <w:sz w:val="18"/>
+              </w:rPr>
+              <w:t>0.9463</w:t>
+            </w:r>
+          </w:p>
+        </w:tc>
+        <w:tc>
+          <w:tcPr>
+            <w:tcW w:type="dxa" w:w="1568"/>
+          </w:tcPr>
+          <w:p>
+            <w:pPr>
+              <w:spacing w:after="40"/>
+            </w:pPr>
+            <w:r>
+              <w:rPr>
+                <w:sz w:val="18"/>
+              </w:rPr>
+            </w:r>
+            <w:r>
+              <w:rPr>
+                <w:sz w:val="18"/>
+              </w:rPr>
+              <w:t>0.8744</w:t>
+            </w:r>
+          </w:p>
+        </w:tc>
+        <w:tc>
+          <w:tcPr>
+            <w:tcW w:type="dxa" w:w="1568"/>
+          </w:tcPr>
+          <w:p>
+            <w:pPr>
+              <w:spacing w:after="40"/>
+            </w:pPr>
+            <w:r>
+              <w:rPr>
+                <w:sz w:val="18"/>
+              </w:rPr>
+            </w:r>
+            <w:r>
+              <w:rPr>
+                <w:b/>
+                <w:sz w:val="18"/>
+              </w:rPr>
+              <w:t>+0.0201</w:t>
+            </w:r>
+          </w:p>
+        </w:tc>
+      </w:tr>
+      <w:tr>
+        <w:tc>
+          <w:tcPr>
+            <w:tcW w:type="dxa" w:w="1568"/>
+          </w:tcPr>
+          <w:p>
+            <w:pPr>
+              <w:spacing w:after="40"/>
+            </w:pPr>
+            <w:r>
+              <w:rPr>
+                <w:sz w:val="18"/>
+              </w:rPr>
+            </w:r>
+            <w:r>
+              <w:rPr>
+                <w:sz w:val="18"/>
+              </w:rPr>
+              <w:t>TRAIN</w:t>
+            </w:r>
+          </w:p>
+        </w:tc>
+        <w:tc>
+          <w:tcPr>
+            <w:tcW w:type="dxa" w:w="1568"/>
+          </w:tcPr>
+          <w:p>
+            <w:pPr>
+              <w:spacing w:after="40"/>
+            </w:pPr>
+            <w:r>
+              <w:rPr>
+                <w:sz w:val="18"/>
+              </w:rPr>
+            </w:r>
+            <w:r>
+              <w:rPr>
+                <w:sz w:val="18"/>
+              </w:rPr>
+              <w:t>华北平原</w:t>
+            </w:r>
+          </w:p>
+        </w:tc>
+        <w:tc>
+          <w:tcPr>
+            <w:tcW w:type="dxa" w:w="1568"/>
+          </w:tcPr>
+          <w:p>
+            <w:pPr>
+              <w:spacing w:after="40"/>
+            </w:pPr>
+            <w:r>
+              <w:rPr>
+                <w:sz w:val="18"/>
+              </w:rPr>
+            </w:r>
+            <w:r>
+              <w:rPr>
+                <w:sz w:val="18"/>
+              </w:rPr>
+              <w:t>0.9671</w:t>
+            </w:r>
+          </w:p>
+        </w:tc>
+        <w:tc>
+          <w:tcPr>
+            <w:tcW w:type="dxa" w:w="1568"/>
+          </w:tcPr>
+          <w:p>
+            <w:pPr>
+              <w:spacing w:after="40"/>
+            </w:pPr>
+            <w:r>
+              <w:rPr>
+                <w:sz w:val="18"/>
+              </w:rPr>
+            </w:r>
+            <w:r>
+              <w:rPr>
+                <w:sz w:val="18"/>
+              </w:rPr>
+              <w:t>0.9515</w:t>
+            </w:r>
+          </w:p>
+        </w:tc>
+        <w:tc>
+          <w:tcPr>
+            <w:tcW w:type="dxa" w:w="1568"/>
+          </w:tcPr>
+          <w:p>
+            <w:pPr>
+              <w:spacing w:after="40"/>
+            </w:pPr>
+            <w:r>
+              <w:rPr>
+                <w:sz w:val="18"/>
+              </w:rPr>
+            </w:r>
+            <w:r>
+              <w:rPr>
+                <w:sz w:val="18"/>
+              </w:rPr>
+              <w:t>0.8849</w:t>
+            </w:r>
+          </w:p>
+        </w:tc>
+        <w:tc>
+          <w:tcPr>
+            <w:tcW w:type="dxa" w:w="1568"/>
+          </w:tcPr>
+          <w:p>
+            <w:pPr>
+              <w:spacing w:after="40"/>
+            </w:pPr>
+            <w:r>
+              <w:rPr>
+                <w:sz w:val="18"/>
+              </w:rPr>
+            </w:r>
+            <w:r>
+              <w:rPr>
+                <w:b/>
+                <w:sz w:val="18"/>
+              </w:rPr>
+              <w:t>+0.0156</w:t>
+            </w:r>
+          </w:p>
+        </w:tc>
+      </w:tr>
+      <w:tr>
+        <w:tc>
+          <w:tcPr>
+            <w:tcW w:type="dxa" w:w="1568"/>
+          </w:tcPr>
+          <w:p>
+            <w:pPr>
+              <w:spacing w:after="40"/>
+            </w:pPr>
+            <w:r>
+              <w:rPr>
+                <w:sz w:val="18"/>
+              </w:rPr>
+            </w:r>
+            <w:r>
+              <w:rPr>
+                <w:sz w:val="18"/>
+              </w:rPr>
+              <w:t>TRAIN</w:t>
+            </w:r>
+          </w:p>
+        </w:tc>
+        <w:tc>
+          <w:tcPr>
+            <w:tcW w:type="dxa" w:w="1568"/>
+          </w:tcPr>
+          <w:p>
+            <w:pPr>
+              <w:spacing w:after="40"/>
+            </w:pPr>
+            <w:r>
+              <w:rPr>
+                <w:sz w:val="18"/>
+              </w:rPr>
+            </w:r>
+            <w:r>
+              <w:rPr>
+                <w:sz w:val="18"/>
+              </w:rPr>
+              <w:t>江汉平原</w:t>
+            </w:r>
+          </w:p>
+        </w:tc>
+        <w:tc>
+          <w:tcPr>
+            <w:tcW w:type="dxa" w:w="1568"/>
+          </w:tcPr>
+          <w:p>
+            <w:pPr>
+              <w:spacing w:after="40"/>
+            </w:pPr>
+            <w:r>
+              <w:rPr>
+                <w:sz w:val="18"/>
+              </w:rPr>
+            </w:r>
+            <w:r>
+              <w:rPr>
+                <w:sz w:val="18"/>
+              </w:rPr>
+              <w:t>0.9509</w:t>
+            </w:r>
+          </w:p>
+        </w:tc>
+        <w:tc>
+          <w:tcPr>
+            <w:tcW w:type="dxa" w:w="1568"/>
+          </w:tcPr>
+          <w:p>
+            <w:pPr>
+              <w:spacing w:after="40"/>
+            </w:pPr>
+            <w:r>
+              <w:rPr>
+                <w:sz w:val="18"/>
+              </w:rPr>
+            </w:r>
+            <w:r>
+              <w:rPr>
+                <w:sz w:val="18"/>
+              </w:rPr>
+              <w:t>0.9368</w:t>
+            </w:r>
+          </w:p>
+        </w:tc>
+        <w:tc>
+          <w:tcPr>
+            <w:tcW w:type="dxa" w:w="1568"/>
+          </w:tcPr>
+          <w:p>
+            <w:pPr>
+              <w:spacing w:after="40"/>
+            </w:pPr>
+            <w:r>
+              <w:rPr>
+                <w:sz w:val="18"/>
+              </w:rPr>
+            </w:r>
+            <w:r>
+              <w:rPr>
+                <w:sz w:val="18"/>
+              </w:rPr>
+              <w:t>0.8574</w:t>
+            </w:r>
+          </w:p>
+        </w:tc>
+        <w:tc>
+          <w:tcPr>
+            <w:tcW w:type="dxa" w:w="1568"/>
+          </w:tcPr>
+          <w:p>
+            <w:pPr>
+              <w:spacing w:after="40"/>
+            </w:pPr>
+            <w:r>
+              <w:rPr>
+                <w:sz w:val="18"/>
+              </w:rPr>
+            </w:r>
+            <w:r>
+              <w:rPr>
+                <w:b/>
+                <w:sz w:val="18"/>
+              </w:rPr>
+              <w:t>+0.0141</w:t>
+            </w:r>
+          </w:p>
+        </w:tc>
+      </w:tr>
+      <w:tr>
+        <w:tc>
+          <w:tcPr>
+            <w:tcW w:type="dxa" w:w="1568"/>
+          </w:tcPr>
+          <w:p>
+            <w:pPr>
+              <w:spacing w:after="40"/>
+            </w:pPr>
+            <w:r>
+              <w:rPr>
+                <w:sz w:val="18"/>
+              </w:rPr>
+            </w:r>
+            <w:r>
+              <w:rPr>
+                <w:sz w:val="18"/>
+              </w:rPr>
+              <w:t>TRAIN</w:t>
+            </w:r>
+          </w:p>
+        </w:tc>
+        <w:tc>
+          <w:tcPr>
+            <w:tcW w:type="dxa" w:w="1568"/>
+          </w:tcPr>
+          <w:p>
+            <w:pPr>
+              <w:spacing w:after="40"/>
+            </w:pPr>
+            <w:r>
+              <w:rPr>
+                <w:sz w:val="18"/>
+              </w:rPr>
+            </w:r>
+            <w:r>
+              <w:rPr>
+                <w:sz w:val="18"/>
+              </w:rPr>
+              <w:t>河套</w:t>
+            </w:r>
+          </w:p>
+        </w:tc>
+        <w:tc>
+          <w:tcPr>
+            <w:tcW w:type="dxa" w:w="1568"/>
+          </w:tcPr>
+          <w:p>
+            <w:pPr>
+              <w:spacing w:after="40"/>
+            </w:pPr>
+            <w:r>
+              <w:rPr>
+                <w:sz w:val="18"/>
+              </w:rPr>
+            </w:r>
+            <w:r>
+              <w:rPr>
+                <w:sz w:val="18"/>
+              </w:rPr>
+              <w:t>0.9625</w:t>
+            </w:r>
+          </w:p>
+        </w:tc>
+        <w:tc>
+          <w:tcPr>
+            <w:tcW w:type="dxa" w:w="1568"/>
+          </w:tcPr>
+          <w:p>
+            <w:pPr>
+              <w:spacing w:after="40"/>
+            </w:pPr>
+            <w:r>
+              <w:rPr>
+                <w:sz w:val="18"/>
+              </w:rPr>
+            </w:r>
+            <w:r>
+              <w:rPr>
+                <w:sz w:val="18"/>
+              </w:rPr>
+              <w:t>0.9496</w:t>
+            </w:r>
+          </w:p>
+        </w:tc>
+        <w:tc>
+          <w:tcPr>
+            <w:tcW w:type="dxa" w:w="1568"/>
+          </w:tcPr>
+          <w:p>
+            <w:pPr>
+              <w:spacing w:after="40"/>
+            </w:pPr>
+            <w:r>
+              <w:rPr>
+                <w:sz w:val="18"/>
+              </w:rPr>
+            </w:r>
+            <w:r>
+              <w:rPr>
+                <w:sz w:val="18"/>
+              </w:rPr>
+              <w:t>0.8768</w:t>
+            </w:r>
+          </w:p>
+        </w:tc>
+        <w:tc>
+          <w:tcPr>
+            <w:tcW w:type="dxa" w:w="1568"/>
+          </w:tcPr>
+          <w:p>
+            <w:pPr>
+              <w:spacing w:after="40"/>
+            </w:pPr>
+            <w:r>
+              <w:rPr>
+                <w:sz w:val="18"/>
+              </w:rPr>
+            </w:r>
+            <w:r>
+              <w:rPr>
+                <w:b/>
+                <w:sz w:val="18"/>
+              </w:rPr>
+              <w:t>+0.0129</w:t>
+            </w:r>
+          </w:p>
+        </w:tc>
+      </w:tr>
+      <w:tr>
+        <w:tc>
+          <w:tcPr>
+            <w:tcW w:type="dxa" w:w="1568"/>
+          </w:tcPr>
+          <w:p>
+            <w:pPr>
+              <w:spacing w:after="40"/>
+            </w:pPr>
+            <w:r>
+              <w:rPr>
+                <w:sz w:val="18"/>
+              </w:rPr>
+            </w:r>
+            <w:r>
+              <w:rPr>
+                <w:sz w:val="18"/>
+              </w:rPr>
+              <w:t>TRAIN</w:t>
+            </w:r>
+          </w:p>
+        </w:tc>
+        <w:tc>
+          <w:tcPr>
+            <w:tcW w:type="dxa" w:w="1568"/>
+          </w:tcPr>
+          <w:p>
+            <w:pPr>
+              <w:spacing w:after="40"/>
+            </w:pPr>
+            <w:r>
+              <w:rPr>
+                <w:sz w:val="18"/>
+              </w:rPr>
+            </w:r>
+            <w:r>
+              <w:rPr>
+                <w:sz w:val="18"/>
+              </w:rPr>
+              <w:t>闽南沿海</w:t>
+            </w:r>
+          </w:p>
+        </w:tc>
+        <w:tc>
+          <w:tcPr>
+            <w:tcW w:type="dxa" w:w="1568"/>
+          </w:tcPr>
+          <w:p>
+            <w:pPr>
+              <w:spacing w:after="40"/>
+            </w:pPr>
+            <w:r>
+              <w:rPr>
+                <w:sz w:val="18"/>
+              </w:rPr>
+            </w:r>
+            <w:r>
+              <w:rPr>
+                <w:sz w:val="18"/>
+              </w:rPr>
+              <w:t>0.9763</w:t>
+            </w:r>
+          </w:p>
+        </w:tc>
+        <w:tc>
+          <w:tcPr>
+            <w:tcW w:type="dxa" w:w="1568"/>
+          </w:tcPr>
+          <w:p>
+            <w:pPr>
+              <w:spacing w:after="40"/>
+            </w:pPr>
+            <w:r>
+              <w:rPr>
+                <w:sz w:val="18"/>
+              </w:rPr>
+            </w:r>
+            <w:r>
+              <w:rPr>
+                <w:sz w:val="18"/>
+              </w:rPr>
+              <w:t>0.9677</w:t>
+            </w:r>
+          </w:p>
+        </w:tc>
+        <w:tc>
+          <w:tcPr>
+            <w:tcW w:type="dxa" w:w="1568"/>
+          </w:tcPr>
+          <w:p>
+            <w:pPr>
+              <w:spacing w:after="40"/>
+            </w:pPr>
+            <w:r>
+              <w:rPr>
+                <w:sz w:val="18"/>
+              </w:rPr>
+            </w:r>
+            <w:r>
+              <w:rPr>
+                <w:sz w:val="18"/>
+              </w:rPr>
+              <w:t>0.9135</w:t>
+            </w:r>
+          </w:p>
+        </w:tc>
+        <w:tc>
+          <w:tcPr>
+            <w:tcW w:type="dxa" w:w="1568"/>
+          </w:tcPr>
+          <w:p>
+            <w:pPr>
+              <w:spacing w:after="40"/>
+            </w:pPr>
+            <w:r>
+              <w:rPr>
+                <w:sz w:val="18"/>
+              </w:rPr>
+            </w:r>
+            <w:r>
+              <w:rPr>
+                <w:b/>
+                <w:sz w:val="18"/>
+              </w:rPr>
+              <w:t>+0.0085</w:t>
+            </w:r>
+          </w:p>
+        </w:tc>
+      </w:tr>
+      <w:tr>
+        <w:tc>
+          <w:tcPr>
+            <w:tcW w:type="dxa" w:w="1568"/>
+          </w:tcPr>
+          <w:p>
+            <w:pPr>
+              <w:spacing w:after="40"/>
+            </w:pPr>
+            <w:r>
+              <w:rPr>
+                <w:sz w:val="18"/>
+              </w:rPr>
+            </w:r>
+            <w:r>
+              <w:rPr>
+                <w:sz w:val="18"/>
+              </w:rPr>
+              <w:t>TRAIN</w:t>
+            </w:r>
+          </w:p>
+        </w:tc>
+        <w:tc>
+          <w:tcPr>
+            <w:tcW w:type="dxa" w:w="1568"/>
+          </w:tcPr>
+          <w:p>
+            <w:pPr>
+              <w:spacing w:after="40"/>
+            </w:pPr>
+            <w:r>
+              <w:rPr>
+                <w:sz w:val="18"/>
+              </w:rPr>
+            </w:r>
+            <w:r>
+              <w:rPr>
+                <w:sz w:val="18"/>
+              </w:rPr>
+              <w:t>长三角</w:t>
+            </w:r>
+          </w:p>
+        </w:tc>
+        <w:tc>
+          <w:tcPr>
+            <w:tcW w:type="dxa" w:w="1568"/>
+          </w:tcPr>
+          <w:p>
+            <w:pPr>
+              <w:spacing w:after="40"/>
+            </w:pPr>
+            <w:r>
+              <w:rPr>
+                <w:sz w:val="18"/>
+              </w:rPr>
+            </w:r>
+            <w:r>
+              <w:rPr>
+                <w:sz w:val="18"/>
+              </w:rPr>
+              <w:t>0.9710</w:t>
+            </w:r>
+          </w:p>
+        </w:tc>
+        <w:tc>
+          <w:tcPr>
+            <w:tcW w:type="dxa" w:w="1568"/>
+          </w:tcPr>
+          <w:p>
+            <w:pPr>
+              <w:spacing w:after="40"/>
+            </w:pPr>
+            <w:r>
+              <w:rPr>
+                <w:sz w:val="18"/>
+              </w:rPr>
+            </w:r>
+            <w:r>
+              <w:rPr>
+                <w:sz w:val="18"/>
+              </w:rPr>
+              <w:t>0.9639</w:t>
+            </w:r>
+          </w:p>
+        </w:tc>
+        <w:tc>
+          <w:tcPr>
+            <w:tcW w:type="dxa" w:w="1568"/>
+          </w:tcPr>
+          <w:p>
+            <w:pPr>
+              <w:spacing w:after="40"/>
+            </w:pPr>
+            <w:r>
+              <w:rPr>
+                <w:sz w:val="18"/>
+              </w:rPr>
+            </w:r>
+            <w:r>
+              <w:rPr>
+                <w:sz w:val="18"/>
+              </w:rPr>
+              <w:t>0.9124</w:t>
+            </w:r>
+          </w:p>
+        </w:tc>
+        <w:tc>
+          <w:tcPr>
+            <w:tcW w:type="dxa" w:w="1568"/>
+          </w:tcPr>
+          <w:p>
+            <w:pPr>
+              <w:spacing w:after="40"/>
+            </w:pPr>
+            <w:r>
+              <w:rPr>
+                <w:sz w:val="18"/>
+              </w:rPr>
+            </w:r>
+            <w:r>
+              <w:rPr>
+                <w:b/>
+                <w:sz w:val="18"/>
+              </w:rPr>
+              <w:t>+0.0072</w:t>
+            </w:r>
+          </w:p>
+        </w:tc>
+      </w:tr>
+      <w:tr>
+        <w:tc>
+          <w:tcPr>
+            <w:tcW w:type="dxa" w:w="1568"/>
+          </w:tcPr>
+          <w:p>
+            <w:pPr>
+              <w:spacing w:after="40"/>
+            </w:pPr>
+            <w:r>
+              <w:rPr>
+                <w:sz w:val="18"/>
+              </w:rPr>
+            </w:r>
+            <w:r>
+              <w:rPr>
+                <w:sz w:val="18"/>
+              </w:rPr>
+              <w:t>TRAIN</w:t>
+            </w:r>
+          </w:p>
+        </w:tc>
+        <w:tc>
+          <w:tcPr>
+            <w:tcW w:type="dxa" w:w="1568"/>
+          </w:tcPr>
+          <w:p>
+            <w:pPr>
+              <w:spacing w:after="40"/>
+            </w:pPr>
+            <w:r>
+              <w:rPr>
+                <w:sz w:val="18"/>
+              </w:rPr>
+            </w:r>
+            <w:r>
+              <w:rPr>
+                <w:sz w:val="18"/>
+              </w:rPr>
+              <w:t>京津冀</w:t>
+            </w:r>
+          </w:p>
+        </w:tc>
+        <w:tc>
+          <w:tcPr>
+            <w:tcW w:type="dxa" w:w="1568"/>
+          </w:tcPr>
+          <w:p>
+            <w:pPr>
+              <w:spacing w:after="40"/>
+            </w:pPr>
+            <w:r>
+              <w:rPr>
+                <w:sz w:val="18"/>
+              </w:rPr>
+            </w:r>
+            <w:r>
+              <w:rPr>
+                <w:sz w:val="18"/>
+              </w:rPr>
+              <w:t>0.9777</w:t>
+            </w:r>
+          </w:p>
+        </w:tc>
+        <w:tc>
+          <w:tcPr>
+            <w:tcW w:type="dxa" w:w="1568"/>
+          </w:tcPr>
+          <w:p>
+            <w:pPr>
+              <w:spacing w:after="40"/>
+            </w:pPr>
+            <w:r>
+              <w:rPr>
+                <w:sz w:val="18"/>
+              </w:rPr>
+            </w:r>
+            <w:r>
+              <w:rPr>
+                <w:sz w:val="18"/>
+              </w:rPr>
+              <w:t>0.9748</w:t>
+            </w:r>
+          </w:p>
+        </w:tc>
+        <w:tc>
+          <w:tcPr>
+            <w:tcW w:type="dxa" w:w="1568"/>
+          </w:tcPr>
+          <w:p>
+            <w:pPr>
+              <w:spacing w:after="40"/>
+            </w:pPr>
+            <w:r>
+              <w:rPr>
+                <w:sz w:val="18"/>
+              </w:rPr>
+            </w:r>
+            <w:r>
+              <w:rPr>
+                <w:sz w:val="18"/>
+              </w:rPr>
+              <w:t>0.9424</w:t>
+            </w:r>
+          </w:p>
+        </w:tc>
+        <w:tc>
+          <w:tcPr>
+            <w:tcW w:type="dxa" w:w="1568"/>
+          </w:tcPr>
+          <w:p>
+            <w:pPr>
+              <w:spacing w:after="40"/>
+            </w:pPr>
+            <w:r>
+              <w:rPr>
+                <w:sz w:val="18"/>
+              </w:rPr>
+            </w:r>
+            <w:r>
+              <w:rPr>
+                <w:b/>
+                <w:sz w:val="18"/>
+              </w:rPr>
+              <w:t>+0.0028</w:t>
+            </w:r>
+          </w:p>
+        </w:tc>
+      </w:tr>
+      <w:tr>
+        <w:tc>
+          <w:tcPr>
+            <w:tcW w:type="dxa" w:w="1568"/>
+          </w:tcPr>
+          <w:p>
+            <w:pPr>
+              <w:spacing w:after="40"/>
+            </w:pPr>
+            <w:r>
+              <w:rPr>
+                <w:sz w:val="18"/>
+              </w:rPr>
+            </w:r>
+            <w:r>
+              <w:rPr>
+                <w:sz w:val="18"/>
+              </w:rPr>
+              <w:t>TRAIN</w:t>
+            </w:r>
+          </w:p>
+        </w:tc>
+        <w:tc>
+          <w:tcPr>
+            <w:tcW w:type="dxa" w:w="1568"/>
+          </w:tcPr>
+          <w:p>
+            <w:pPr>
+              <w:spacing w:after="40"/>
+            </w:pPr>
+            <w:r>
+              <w:rPr>
+                <w:sz w:val="18"/>
+              </w:rPr>
+            </w:r>
+            <w:r>
+              <w:rPr>
+                <w:sz w:val="18"/>
+              </w:rPr>
+              <w:t>云南</w:t>
+            </w:r>
+          </w:p>
+        </w:tc>
+        <w:tc>
+          <w:tcPr>
+            <w:tcW w:type="dxa" w:w="1568"/>
+          </w:tcPr>
+          <w:p>
+            <w:pPr>
+              <w:spacing w:after="40"/>
+            </w:pPr>
+            <w:r>
+              <w:rPr>
+                <w:sz w:val="18"/>
+              </w:rPr>
+            </w:r>
+            <w:r>
+              <w:rPr>
+                <w:sz w:val="18"/>
+              </w:rPr>
+              <w:t>0.9687</w:t>
+            </w:r>
+          </w:p>
+        </w:tc>
+        <w:tc>
+          <w:tcPr>
+            <w:tcW w:type="dxa" w:w="1568"/>
+          </w:tcPr>
+          <w:p>
+            <w:pPr>
+              <w:spacing w:after="40"/>
+            </w:pPr>
+            <w:r>
+              <w:rPr>
+                <w:sz w:val="18"/>
+              </w:rPr>
+            </w:r>
+            <w:r>
+              <w:rPr>
+                <w:sz w:val="18"/>
+              </w:rPr>
+              <w:t>0.9660</w:t>
+            </w:r>
+          </w:p>
+        </w:tc>
+        <w:tc>
+          <w:tcPr>
+            <w:tcW w:type="dxa" w:w="1568"/>
+          </w:tcPr>
+          <w:p>
+            <w:pPr>
+              <w:spacing w:after="40"/>
+            </w:pPr>
+            <w:r>
+              <w:rPr>
+                <w:sz w:val="18"/>
+              </w:rPr>
+            </w:r>
+            <w:r>
+              <w:rPr>
+                <w:sz w:val="18"/>
+              </w:rPr>
+              <w:t>0.9149</w:t>
+            </w:r>
+          </w:p>
+        </w:tc>
+        <w:tc>
+          <w:tcPr>
+            <w:tcW w:type="dxa" w:w="1568"/>
+          </w:tcPr>
+          <w:p>
+            <w:pPr>
+              <w:spacing w:after="40"/>
+            </w:pPr>
+            <w:r>
+              <w:rPr>
+                <w:sz w:val="18"/>
+              </w:rPr>
+            </w:r>
+            <w:r>
+              <w:rPr>
+                <w:b/>
+                <w:sz w:val="18"/>
+              </w:rPr>
+              <w:t>+0.0027</w:t>
+            </w:r>
+          </w:p>
+        </w:tc>
+      </w:tr>
+      <w:tr>
+        <w:tc>
+          <w:tcPr>
+            <w:tcW w:type="dxa" w:w="1568"/>
+          </w:tcPr>
+          <w:p>
+            <w:pPr>
+              <w:spacing w:after="40"/>
+            </w:pPr>
+            <w:r>
+              <w:rPr>
+                <w:sz w:val="18"/>
+              </w:rPr>
+            </w:r>
+            <w:r>
+              <w:rPr>
+                <w:sz w:val="18"/>
+              </w:rPr>
+              <w:t>TRAIN</w:t>
+            </w:r>
+          </w:p>
+        </w:tc>
+        <w:tc>
+          <w:tcPr>
+            <w:tcW w:type="dxa" w:w="1568"/>
+          </w:tcPr>
+          <w:p>
+            <w:pPr>
+              <w:spacing w:after="40"/>
+            </w:pPr>
+            <w:r>
+              <w:rPr>
+                <w:sz w:val="18"/>
+              </w:rPr>
+            </w:r>
+            <w:r>
+              <w:rPr>
+                <w:sz w:val="18"/>
+              </w:rPr>
+              <w:t>大兴安岭</w:t>
+            </w:r>
+          </w:p>
+        </w:tc>
+        <w:tc>
+          <w:tcPr>
+            <w:tcW w:type="dxa" w:w="1568"/>
+          </w:tcPr>
+          <w:p>
+            <w:pPr>
+              <w:spacing w:after="40"/>
+            </w:pPr>
+            <w:r>
+              <w:rPr>
+                <w:sz w:val="18"/>
+              </w:rPr>
+            </w:r>
+            <w:r>
+              <w:rPr>
+                <w:sz w:val="18"/>
+              </w:rPr>
+              <w:t>0.9861</w:t>
+            </w:r>
+          </w:p>
+        </w:tc>
+        <w:tc>
+          <w:tcPr>
+            <w:tcW w:type="dxa" w:w="1568"/>
+          </w:tcPr>
+          <w:p>
+            <w:pPr>
+              <w:spacing w:after="40"/>
+            </w:pPr>
+            <w:r>
+              <w:rPr>
+                <w:sz w:val="18"/>
+              </w:rPr>
+            </w:r>
+            <w:r>
+              <w:rPr>
+                <w:sz w:val="18"/>
+              </w:rPr>
+              <w:t>0.9836</w:t>
+            </w:r>
+          </w:p>
+        </w:tc>
+        <w:tc>
+          <w:tcPr>
+            <w:tcW w:type="dxa" w:w="1568"/>
+          </w:tcPr>
+          <w:p>
+            <w:pPr>
+              <w:spacing w:after="40"/>
+            </w:pPr>
+            <w:r>
+              <w:rPr>
+                <w:sz w:val="18"/>
+              </w:rPr>
+            </w:r>
+            <w:r>
+              <w:rPr>
+                <w:sz w:val="18"/>
+              </w:rPr>
+              <w:t>0.9557</w:t>
+            </w:r>
+          </w:p>
+        </w:tc>
+        <w:tc>
+          <w:tcPr>
+            <w:tcW w:type="dxa" w:w="1568"/>
+          </w:tcPr>
+          <w:p>
+            <w:pPr>
+              <w:spacing w:after="40"/>
+            </w:pPr>
+            <w:r>
+              <w:rPr>
+                <w:sz w:val="18"/>
+              </w:rPr>
+            </w:r>
+            <w:r>
+              <w:rPr>
+                <w:b/>
+                <w:sz w:val="18"/>
+              </w:rPr>
+              <w:t>+0.0025</w:t>
+            </w:r>
+          </w:p>
+        </w:tc>
+      </w:tr>
+      <w:tr>
+        <w:tc>
+          <w:tcPr>
+            <w:tcW w:type="dxa" w:w="1568"/>
+          </w:tcPr>
+          <w:p>
+            <w:pPr>
+              <w:spacing w:after="40"/>
+            </w:pPr>
+            <w:r>
+              <w:rPr>
+                <w:sz w:val="18"/>
+              </w:rPr>
+            </w:r>
+            <w:r>
+              <w:rPr>
+                <w:sz w:val="18"/>
+              </w:rPr>
+              <w:t>TRAIN</w:t>
+            </w:r>
+          </w:p>
+        </w:tc>
+        <w:tc>
+          <w:tcPr>
+            <w:tcW w:type="dxa" w:w="1568"/>
+          </w:tcPr>
+          <w:p>
+            <w:pPr>
+              <w:spacing w:after="40"/>
+            </w:pPr>
+            <w:r>
+              <w:rPr>
+                <w:sz w:val="18"/>
+              </w:rPr>
+            </w:r>
+            <w:r>
+              <w:rPr>
+                <w:sz w:val="18"/>
+              </w:rPr>
+              <w:t>关中</w:t>
+            </w:r>
+          </w:p>
+        </w:tc>
+        <w:tc>
+          <w:tcPr>
+            <w:tcW w:type="dxa" w:w="1568"/>
+          </w:tcPr>
+          <w:p>
+            <w:pPr>
+              <w:spacing w:after="40"/>
+            </w:pPr>
+            <w:r>
+              <w:rPr>
+                <w:sz w:val="18"/>
+              </w:rPr>
+            </w:r>
+            <w:r>
+              <w:rPr>
+                <w:sz w:val="18"/>
+              </w:rPr>
+              <w:t>0.9780</w:t>
+            </w:r>
+          </w:p>
+        </w:tc>
+        <w:tc>
+          <w:tcPr>
+            <w:tcW w:type="dxa" w:w="1568"/>
+          </w:tcPr>
+          <w:p>
+            <w:pPr>
+              <w:spacing w:after="40"/>
+            </w:pPr>
+            <w:r>
+              <w:rPr>
+                <w:sz w:val="18"/>
+              </w:rPr>
+            </w:r>
+            <w:r>
+              <w:rPr>
+                <w:sz w:val="18"/>
+              </w:rPr>
+              <w:t>0.9750</w:t>
+            </w:r>
+          </w:p>
+        </w:tc>
+        <w:tc>
+          <w:tcPr>
+            <w:tcW w:type="dxa" w:w="1568"/>
+          </w:tcPr>
+          <w:p>
+            <w:pPr>
+              <w:spacing w:after="40"/>
+            </w:pPr>
+            <w:r>
+              <w:rPr>
+                <w:sz w:val="18"/>
+              </w:rPr>
+            </w:r>
+            <w:r>
+              <w:rPr>
+                <w:sz w:val="18"/>
+              </w:rPr>
+              <w:t>0.9423</w:t>
+            </w:r>
+          </w:p>
+        </w:tc>
+        <w:tc>
+          <w:tcPr>
+            <w:tcW w:type="dxa" w:w="1568"/>
+          </w:tcPr>
+          <w:p>
+            <w:pPr>
+              <w:spacing w:after="40"/>
+            </w:pPr>
+            <w:r>
+              <w:rPr>
+                <w:sz w:val="18"/>
+              </w:rPr>
+            </w:r>
+            <w:r>
+              <w:rPr>
+                <w:b/>
+                <w:sz w:val="18"/>
+              </w:rPr>
+              <w:t>+0.0029</w:t>
+            </w:r>
+          </w:p>
+        </w:tc>
+      </w:tr>
+      <w:tr>
+        <w:tc>
+          <w:tcPr>
+            <w:tcW w:type="dxa" w:w="1568"/>
+          </w:tcPr>
+          <w:p>
+            <w:pPr>
+              <w:spacing w:after="40"/>
+            </w:pPr>
+            <w:r>
+              <w:rPr>
+                <w:sz w:val="18"/>
+              </w:rPr>
+            </w:r>
+            <w:r>
+              <w:rPr>
+                <w:sz w:val="18"/>
+              </w:rPr>
+              <w:t>TRAIN</w:t>
+            </w:r>
+          </w:p>
+        </w:tc>
+        <w:tc>
+          <w:tcPr>
+            <w:tcW w:type="dxa" w:w="1568"/>
+          </w:tcPr>
+          <w:p>
+            <w:pPr>
+              <w:spacing w:after="40"/>
+            </w:pPr>
+            <w:r>
+              <w:rPr>
+                <w:sz w:val="18"/>
+              </w:rPr>
+            </w:r>
+            <w:r>
+              <w:rPr>
+                <w:sz w:val="18"/>
+              </w:rPr>
+              <w:t>成都平原</w:t>
+            </w:r>
+          </w:p>
+        </w:tc>
+        <w:tc>
+          <w:tcPr>
+            <w:tcW w:type="dxa" w:w="1568"/>
+          </w:tcPr>
+          <w:p>
+            <w:pPr>
+              <w:spacing w:after="40"/>
+            </w:pPr>
+            <w:r>
+              <w:rPr>
+                <w:sz w:val="18"/>
+              </w:rPr>
+            </w:r>
+            <w:r>
+              <w:rPr>
+                <w:sz w:val="18"/>
+              </w:rPr>
+              <w:t>0.9821</w:t>
+            </w:r>
+          </w:p>
+        </w:tc>
+        <w:tc>
+          <w:tcPr>
+            <w:tcW w:type="dxa" w:w="1568"/>
+          </w:tcPr>
+          <w:p>
+            <w:pPr>
+              <w:spacing w:after="40"/>
+            </w:pPr>
+            <w:r>
+              <w:rPr>
+                <w:sz w:val="18"/>
+              </w:rPr>
+            </w:r>
+            <w:r>
+              <w:rPr>
+                <w:sz w:val="18"/>
+              </w:rPr>
+              <w:t>0.9826</w:t>
+            </w:r>
+          </w:p>
+        </w:tc>
+        <w:tc>
+          <w:tcPr>
+            <w:tcW w:type="dxa" w:w="1568"/>
+          </w:tcPr>
+          <w:p>
+            <w:pPr>
+              <w:spacing w:after="40"/>
+            </w:pPr>
+            <w:r>
+              <w:rPr>
+                <w:sz w:val="18"/>
+              </w:rPr>
+            </w:r>
+            <w:r>
+              <w:rPr>
+                <w:sz w:val="18"/>
+              </w:rPr>
+              <w:t>0.9609</w:t>
+            </w:r>
+          </w:p>
+        </w:tc>
+        <w:tc>
+          <w:tcPr>
+            <w:tcW w:type="dxa" w:w="1568"/>
+          </w:tcPr>
+          <w:p>
+            <w:pPr>
+              <w:spacing w:after="40"/>
+            </w:pPr>
+            <w:r>
+              <w:rPr>
+                <w:sz w:val="18"/>
+              </w:rPr>
+            </w:r>
+            <w:r>
+              <w:rPr>
+                <w:sz w:val="18"/>
+              </w:rPr>
+              <w:t>-0.0005</w:t>
+            </w:r>
+          </w:p>
+        </w:tc>
+      </w:tr>
+      <w:tr>
+        <w:tc>
+          <w:tcPr>
+            <w:tcW w:type="dxa" w:w="1568"/>
+          </w:tcPr>
+          <w:p>
+            <w:pPr>
+              <w:spacing w:after="40"/>
+            </w:pPr>
+            <w:r>
+              <w:rPr>
+                <w:sz w:val="18"/>
+              </w:rPr>
+            </w:r>
+            <w:r>
+              <w:rPr>
+                <w:sz w:val="18"/>
+              </w:rPr>
+              <w:t>VAL</w:t>
+            </w:r>
+          </w:p>
+        </w:tc>
+        <w:tc>
+          <w:tcPr>
+            <w:tcW w:type="dxa" w:w="1568"/>
+          </w:tcPr>
+          <w:p>
+            <w:pPr>
+              <w:spacing w:after="40"/>
+            </w:pPr>
+            <w:r>
+              <w:rPr>
+                <w:sz w:val="18"/>
+              </w:rPr>
+            </w:r>
+            <w:r>
+              <w:rPr>
+                <w:sz w:val="18"/>
+              </w:rPr>
+              <w:t>珠三角</w:t>
+            </w:r>
+          </w:p>
+        </w:tc>
+        <w:tc>
+          <w:tcPr>
+            <w:tcW w:type="dxa" w:w="1568"/>
+          </w:tcPr>
+          <w:p>
+            <w:pPr>
+              <w:spacing w:after="40"/>
+            </w:pPr>
+            <w:r>
+              <w:rPr>
+                <w:sz w:val="18"/>
+              </w:rPr>
+            </w:r>
+            <w:r>
+              <w:rPr>
+                <w:sz w:val="18"/>
+              </w:rPr>
+              <w:t>0.9659</w:t>
+            </w:r>
+          </w:p>
+        </w:tc>
+        <w:tc>
+          <w:tcPr>
+            <w:tcW w:type="dxa" w:w="1568"/>
+          </w:tcPr>
+          <w:p>
+            <w:pPr>
+              <w:spacing w:after="40"/>
+            </w:pPr>
+            <w:r>
+              <w:rPr>
+                <w:sz w:val="18"/>
+              </w:rPr>
+            </w:r>
+            <w:r>
+              <w:rPr>
+                <w:sz w:val="18"/>
+              </w:rPr>
+              <w:t>0.9654</w:t>
+            </w:r>
+          </w:p>
+        </w:tc>
+        <w:tc>
+          <w:tcPr>
+            <w:tcW w:type="dxa" w:w="1568"/>
+          </w:tcPr>
+          <w:p>
+            <w:pPr>
+              <w:spacing w:after="40"/>
+            </w:pPr>
+            <w:r>
+              <w:rPr>
+                <w:sz w:val="18"/>
+              </w:rPr>
+            </w:r>
+            <w:r>
+              <w:rPr>
+                <w:sz w:val="18"/>
+              </w:rPr>
+              <w:t>0.9144</w:t>
+            </w:r>
+          </w:p>
+        </w:tc>
+        <w:tc>
+          <w:tcPr>
+            <w:tcW w:type="dxa" w:w="1568"/>
+          </w:tcPr>
+          <w:p>
+            <w:pPr>
+              <w:spacing w:after="40"/>
+            </w:pPr>
+            <w:r>
+              <w:rPr>
+                <w:sz w:val="18"/>
+              </w:rPr>
+            </w:r>
+            <w:r>
+              <w:rPr>
+                <w:sz w:val="18"/>
+              </w:rPr>
+              <w:t>+0.0006</w:t>
+            </w:r>
+          </w:p>
+        </w:tc>
+      </w:tr>
+      <w:tr>
+        <w:tc>
+          <w:tcPr>
+            <w:tcW w:type="dxa" w:w="1568"/>
+          </w:tcPr>
+          <w:p>
+            <w:pPr>
+              <w:spacing w:after="40"/>
+            </w:pPr>
+            <w:r>
+              <w:rPr>
+                <w:sz w:val="18"/>
+              </w:rPr>
+            </w:r>
+            <w:r>
+              <w:rPr>
+                <w:sz w:val="18"/>
+              </w:rPr>
+              <w:t>VAL</w:t>
+            </w:r>
+          </w:p>
+        </w:tc>
+        <w:tc>
+          <w:tcPr>
+            <w:tcW w:type="dxa" w:w="1568"/>
+          </w:tcPr>
+          <w:p>
+            <w:pPr>
+              <w:spacing w:after="40"/>
+            </w:pPr>
+            <w:r>
+              <w:rPr>
+                <w:sz w:val="18"/>
+              </w:rPr>
+            </w:r>
+            <w:r>
+              <w:rPr>
+                <w:sz w:val="18"/>
+              </w:rPr>
+              <w:t>鄱阳湖</w:t>
+            </w:r>
+          </w:p>
+        </w:tc>
+        <w:tc>
+          <w:tcPr>
+            <w:tcW w:type="dxa" w:w="1568"/>
+          </w:tcPr>
+          <w:p>
+            <w:pPr>
+              <w:spacing w:after="40"/>
+            </w:pPr>
+            <w:r>
+              <w:rPr>
+                <w:sz w:val="18"/>
+              </w:rPr>
+            </w:r>
+            <w:r>
+              <w:rPr>
+                <w:sz w:val="18"/>
+              </w:rPr>
+              <w:t>0.9005</w:t>
+            </w:r>
+          </w:p>
+        </w:tc>
+        <w:tc>
+          <w:tcPr>
+            <w:tcW w:type="dxa" w:w="1568"/>
+          </w:tcPr>
+          <w:p>
+            <w:pPr>
+              <w:spacing w:after="40"/>
+            </w:pPr>
+            <w:r>
+              <w:rPr>
+                <w:sz w:val="18"/>
+              </w:rPr>
+            </w:r>
+            <w:r>
+              <w:rPr>
+                <w:sz w:val="18"/>
+              </w:rPr>
+              <w:t>0.9149</w:t>
+            </w:r>
+          </w:p>
+        </w:tc>
+        <w:tc>
+          <w:tcPr>
+            <w:tcW w:type="dxa" w:w="1568"/>
+          </w:tcPr>
+          <w:p>
+            <w:pPr>
+              <w:spacing w:after="40"/>
+            </w:pPr>
+            <w:r>
+              <w:rPr>
+                <w:sz w:val="18"/>
+              </w:rPr>
+            </w:r>
+            <w:r>
+              <w:rPr>
+                <w:sz w:val="18"/>
+              </w:rPr>
+              <w:t>0.8087</w:t>
+            </w:r>
+          </w:p>
+        </w:tc>
+        <w:tc>
+          <w:tcPr>
+            <w:tcW w:type="dxa" w:w="1568"/>
+          </w:tcPr>
+          <w:p>
+            <w:pPr>
+              <w:spacing w:after="40"/>
+            </w:pPr>
+            <w:r>
+              <w:rPr>
+                <w:sz w:val="18"/>
+              </w:rPr>
+            </w:r>
+            <w:r>
+              <w:rPr>
+                <w:sz w:val="18"/>
+              </w:rPr>
+              <w:t>-0.0144</w:t>
+            </w:r>
+          </w:p>
+        </w:tc>
+      </w:tr>
+      <w:tr>
+        <w:tc>
+          <w:tcPr>
+            <w:tcW w:type="dxa" w:w="1568"/>
+          </w:tcPr>
+          <w:p>
+            <w:pPr>
+              <w:spacing w:after="40"/>
+            </w:pPr>
+            <w:r>
+              <w:rPr>
+                <w:sz w:val="18"/>
+              </w:rPr>
+            </w:r>
+            <w:r>
+              <w:rPr>
+                <w:sz w:val="18"/>
+              </w:rPr>
+              <w:t>TEST</w:t>
+            </w:r>
+          </w:p>
+        </w:tc>
+        <w:tc>
+          <w:tcPr>
+            <w:tcW w:type="dxa" w:w="1568"/>
+          </w:tcPr>
+          <w:p>
+            <w:pPr>
+              <w:spacing w:after="40"/>
+            </w:pPr>
+            <w:r>
+              <w:rPr>
+                <w:sz w:val="18"/>
+              </w:rPr>
+            </w:r>
+            <w:r>
+              <w:rPr>
+                <w:sz w:val="18"/>
+              </w:rPr>
+              <w:t>武夷山</w:t>
+            </w:r>
+          </w:p>
+        </w:tc>
+        <w:tc>
+          <w:tcPr>
+            <w:tcW w:type="dxa" w:w="1568"/>
+          </w:tcPr>
+          <w:p>
+            <w:pPr>
+              <w:spacing w:after="40"/>
+            </w:pPr>
+            <w:r>
+              <w:rPr>
+                <w:sz w:val="18"/>
+              </w:rPr>
+            </w:r>
+            <w:r>
+              <w:rPr>
+                <w:sz w:val="18"/>
+              </w:rPr>
+              <w:t>0.9431</w:t>
+            </w:r>
+          </w:p>
+        </w:tc>
+        <w:tc>
+          <w:tcPr>
+            <w:tcW w:type="dxa" w:w="1568"/>
+          </w:tcPr>
+          <w:p>
+            <w:pPr>
+              <w:spacing w:after="40"/>
+            </w:pPr>
+            <w:r>
+              <w:rPr>
+                <w:sz w:val="18"/>
+              </w:rPr>
+            </w:r>
+            <w:r>
+              <w:rPr>
+                <w:sz w:val="18"/>
+              </w:rPr>
+              <w:t>0.9670</w:t>
+            </w:r>
+          </w:p>
+        </w:tc>
+        <w:tc>
+          <w:tcPr>
+            <w:tcW w:type="dxa" w:w="1568"/>
+          </w:tcPr>
+          <w:p>
+            <w:pPr>
+              <w:spacing w:after="40"/>
+            </w:pPr>
+            <w:r>
+              <w:rPr>
+                <w:sz w:val="18"/>
+              </w:rPr>
+            </w:r>
+            <w:r>
+              <w:rPr>
+                <w:sz w:val="18"/>
+              </w:rPr>
+              <w:t>0.9043</w:t>
+            </w:r>
+          </w:p>
+        </w:tc>
+        <w:tc>
+          <w:tcPr>
+            <w:tcW w:type="dxa" w:w="1568"/>
+          </w:tcPr>
+          <w:p>
+            <w:pPr>
+              <w:spacing w:after="40"/>
+            </w:pPr>
+            <w:r>
+              <w:rPr>
+                <w:sz w:val="18"/>
+              </w:rPr>
+            </w:r>
+            <w:r>
+              <w:rPr>
+                <w:sz w:val="18"/>
+              </w:rPr>
+              <w:t>-0.0239</w:t>
+            </w:r>
+          </w:p>
+        </w:tc>
+      </w:tr>
+      <w:tr>
+        <w:tc>
+          <w:tcPr>
+            <w:tcW w:type="dxa" w:w="1568"/>
+          </w:tcPr>
+          <w:p>
+            <w:pPr>
+              <w:spacing w:after="40"/>
+            </w:pPr>
+            <w:r>
+              <w:rPr>
+                <w:sz w:val="18"/>
+              </w:rPr>
+            </w:r>
+            <w:r>
+              <w:rPr>
+                <w:sz w:val="18"/>
+              </w:rPr>
+              <w:t>OOD</w:t>
+            </w:r>
+          </w:p>
+        </w:tc>
+        <w:tc>
+          <w:tcPr>
+            <w:tcW w:type="dxa" w:w="1568"/>
+          </w:tcPr>
+          <w:p>
+            <w:pPr>
+              <w:spacing w:after="40"/>
+            </w:pPr>
+            <w:r>
+              <w:rPr>
+                <w:sz w:val="18"/>
+              </w:rPr>
+            </w:r>
+            <w:r>
+              <w:rPr>
+                <w:sz w:val="18"/>
+              </w:rPr>
+              <w:t>三峡水库</w:t>
+            </w:r>
+          </w:p>
+        </w:tc>
+        <w:tc>
+          <w:tcPr>
+            <w:tcW w:type="dxa" w:w="1568"/>
+          </w:tcPr>
+          <w:p>
+            <w:pPr>
+              <w:spacing w:after="40"/>
+            </w:pPr>
+            <w:r>
+              <w:rPr>
+                <w:sz w:val="18"/>
+              </w:rPr>
+            </w:r>
+            <w:r>
+              <w:rPr>
+                <w:sz w:val="18"/>
+              </w:rPr>
+              <w:t>0.9610</w:t>
+            </w:r>
+          </w:p>
+        </w:tc>
+        <w:tc>
+          <w:tcPr>
+            <w:tcW w:type="dxa" w:w="1568"/>
+          </w:tcPr>
+          <w:p>
+            <w:pPr>
+              <w:spacing w:after="40"/>
+            </w:pPr>
+            <w:r>
+              <w:rPr>
+                <w:sz w:val="18"/>
+              </w:rPr>
+            </w:r>
+            <w:r>
+              <w:rPr>
+                <w:sz w:val="18"/>
+              </w:rPr>
+              <w:t>0.9745</w:t>
+            </w:r>
+          </w:p>
+        </w:tc>
+        <w:tc>
+          <w:tcPr>
+            <w:tcW w:type="dxa" w:w="1568"/>
+          </w:tcPr>
+          <w:p>
+            <w:pPr>
+              <w:spacing w:after="40"/>
+            </w:pPr>
+            <w:r>
+              <w:rPr>
+                <w:sz w:val="18"/>
+              </w:rPr>
+            </w:r>
+            <w:r>
+              <w:rPr>
+                <w:sz w:val="18"/>
+              </w:rPr>
+              <w:t>0.9279</w:t>
+            </w:r>
+          </w:p>
+        </w:tc>
+        <w:tc>
+          <w:tcPr>
+            <w:tcW w:type="dxa" w:w="1568"/>
+          </w:tcPr>
+          <w:p>
+            <w:pPr>
+              <w:spacing w:after="40"/>
+            </w:pPr>
+            <w:r>
+              <w:rPr>
+                <w:sz w:val="18"/>
+              </w:rPr>
+            </w:r>
+            <w:r>
+              <w:rPr>
+                <w:sz w:val="18"/>
+              </w:rPr>
+              <w:t>-0.0135</w:t>
+            </w:r>
+          </w:p>
+        </w:tc>
+      </w:tr>
+      <w:tr>
+        <w:tc>
+          <w:tcPr>
+            <w:tcW w:type="dxa" w:w="1568"/>
+          </w:tcPr>
+          <w:p>
+            <w:pPr>
+              <w:spacing w:after="40"/>
+            </w:pPr>
+            <w:r>
+              <w:rPr>
+                <w:sz w:val="18"/>
+              </w:rPr>
+            </w:r>
+            <w:r>
+              <w:rPr>
+                <w:sz w:val="18"/>
+              </w:rPr>
+              <w:t>OOD</w:t>
+            </w:r>
+          </w:p>
+        </w:tc>
+        <w:tc>
+          <w:tcPr>
+            <w:tcW w:type="dxa" w:w="1568"/>
+          </w:tcPr>
+          <w:p>
+            <w:pPr>
+              <w:spacing w:after="40"/>
+            </w:pPr>
+            <w:r>
+              <w:rPr>
+                <w:sz w:val="18"/>
+              </w:rPr>
+            </w:r>
+            <w:r>
+              <w:rPr>
+                <w:sz w:val="18"/>
+              </w:rPr>
+              <w:t>拉萨河谷</w:t>
+            </w:r>
+          </w:p>
+        </w:tc>
+        <w:tc>
+          <w:tcPr>
+            <w:tcW w:type="dxa" w:w="1568"/>
+          </w:tcPr>
+          <w:p>
+            <w:pPr>
+              <w:spacing w:after="40"/>
+            </w:pPr>
+            <w:r>
+              <w:rPr>
+                <w:sz w:val="18"/>
+              </w:rPr>
+            </w:r>
+            <w:r>
+              <w:rPr>
+                <w:sz w:val="18"/>
+              </w:rPr>
+              <w:t>0.8275</w:t>
+            </w:r>
+          </w:p>
+        </w:tc>
+        <w:tc>
+          <w:tcPr>
+            <w:tcW w:type="dxa" w:w="1568"/>
+          </w:tcPr>
+          <w:p>
+            <w:pPr>
+              <w:spacing w:after="40"/>
+            </w:pPr>
+            <w:r>
+              <w:rPr>
+                <w:sz w:val="18"/>
+              </w:rPr>
+            </w:r>
+            <w:r>
+              <w:rPr>
+                <w:sz w:val="18"/>
+              </w:rPr>
+              <w:t>0.9644</w:t>
+            </w:r>
+          </w:p>
+        </w:tc>
+        <w:tc>
+          <w:tcPr>
+            <w:tcW w:type="dxa" w:w="1568"/>
+          </w:tcPr>
+          <w:p>
+            <w:pPr>
+              <w:spacing w:after="40"/>
+            </w:pPr>
+            <w:r>
+              <w:rPr>
+                <w:sz w:val="18"/>
+              </w:rPr>
+            </w:r>
+            <w:r>
+              <w:rPr>
+                <w:sz w:val="18"/>
+              </w:rPr>
+              <w:t>0.9346</w:t>
+            </w:r>
+          </w:p>
+        </w:tc>
+        <w:tc>
+          <w:tcPr>
+            <w:tcW w:type="dxa" w:w="1568"/>
+          </w:tcPr>
+          <w:p>
+            <w:pPr>
+              <w:spacing w:after="40"/>
+            </w:pPr>
+            <w:r>
+              <w:rPr>
+                <w:sz w:val="18"/>
+              </w:rPr>
+            </w:r>
+            <w:r>
+              <w:rPr>
+                <w:b/>
+                <w:sz w:val="18"/>
+              </w:rPr>
+              <w:t>-0.1369</w:t>
+            </w:r>
+          </w:p>
+        </w:tc>
+      </w:tr>
+    </w:tbl>
+    <w:p>
+      <w:pPr>
+        <w:pStyle w:val="Heading4"/>
+      </w:pPr>
+      <w:r>
+        <w:rPr>
+          <w:rFonts w:ascii="Calibri" w:hAnsi="Calibri"/>
+          <w:color w:val="1A1A2E"/>
+        </w:rPr>
+        <w:t>Phase 1 → Phase 2 改善对比</w:t>
+      </w:r>
+    </w:p>
+    <w:tbl>
+      <w:tblPr>
+        <w:tblStyle w:val="LightGrid-Accent1"/>
+        <w:tblW w:type="auto" w:w="0"/>
+        <w:jc w:val="center"/>
+        <w:tblLook w:firstColumn="1" w:firstRow="1" w:lastColumn="0" w:lastRow="0" w:noHBand="0" w:noVBand="1" w:val="04A0"/>
+      </w:tblPr>
+      <w:tblGrid>
+        <w:gridCol w:w="2351"/>
+        <w:gridCol w:w="2351"/>
+        <w:gridCol w:w="2351"/>
+        <w:gridCol w:w="2351"/>
+      </w:tblGrid>
+      <w:tr>
+        <w:tc>
+          <w:tcPr>
+            <w:tcW w:type="dxa" w:w="2351"/>
+          </w:tcPr>
+          <w:p>
+            <w:pPr>
+              <w:spacing w:after="40"/>
+            </w:pPr>
+            <w:r>
+              <w:rPr>
+                <w:b/>
+                <w:sz w:val="18"/>
+              </w:rPr>
+            </w:r>
+            <w:r>
+              <w:rPr>
+                <w:b/>
+                <w:sz w:val="18"/>
+              </w:rPr>
+              <w:t>指标</w:t>
+            </w:r>
+          </w:p>
+        </w:tc>
+        <w:tc>
+          <w:tcPr>
+            <w:tcW w:type="dxa" w:w="2351"/>
+          </w:tcPr>
+          <w:p>
+            <w:pPr>
+              <w:spacing w:after="40"/>
+            </w:pPr>
+            <w:r>
+              <w:rPr>
+                <w:b/>
+                <w:sz w:val="18"/>
+              </w:rPr>
+            </w:r>
+            <w:r>
+              <w:rPr>
+                <w:b/>
+                <w:sz w:val="18"/>
+              </w:rPr>
+              <w:t>Phase 1 (2区域)</w:t>
+            </w:r>
+          </w:p>
+        </w:tc>
+        <w:tc>
+          <w:tcPr>
+            <w:tcW w:type="dxa" w:w="2351"/>
+          </w:tcPr>
+          <w:p>
+            <w:pPr>
+              <w:spacing w:after="40"/>
+            </w:pPr>
+            <w:r>
+              <w:rPr>
+                <w:b/>
+                <w:sz w:val="18"/>
+              </w:rPr>
+            </w:r>
+            <w:r>
+              <w:rPr>
+                <w:b/>
+                <w:sz w:val="18"/>
+              </w:rPr>
+              <w:t>Phase 2 (12区域)</w:t>
+            </w:r>
+          </w:p>
+        </w:tc>
+        <w:tc>
+          <w:tcPr>
+            <w:tcW w:type="dxa" w:w="2351"/>
+          </w:tcPr>
+          <w:p>
+            <w:pPr>
+              <w:spacing w:after="40"/>
+            </w:pPr>
+            <w:r>
+              <w:rPr>
+                <w:b/>
+                <w:sz w:val="18"/>
+              </w:rPr>
+            </w:r>
+            <w:r>
+              <w:rPr>
+                <w:b/>
+                <w:sz w:val="18"/>
+              </w:rPr>
+              <w:t>改善</w:t>
+            </w:r>
+          </w:p>
+        </w:tc>
+      </w:tr>
+      <w:tr>
+        <w:tc>
+          <w:tcPr>
+            <w:tcW w:type="dxa" w:w="2351"/>
+          </w:tcPr>
+          <w:p>
+            <w:pPr>
+              <w:spacing w:after="40"/>
+            </w:pPr>
+            <w:r>
+              <w:rPr>
+                <w:sz w:val="18"/>
+              </w:rPr>
+            </w:r>
+            <w:r>
+              <w:rPr>
+                <w:sz w:val="18"/>
+              </w:rPr>
+              <w:t>训练集模型胜率</w:t>
+            </w:r>
+          </w:p>
+        </w:tc>
+        <w:tc>
+          <w:tcPr>
+            <w:tcW w:type="dxa" w:w="2351"/>
+          </w:tcPr>
+          <w:p>
+            <w:pPr>
+              <w:spacing w:after="40"/>
+            </w:pPr>
+            <w:r>
+              <w:rPr>
+                <w:sz w:val="18"/>
+              </w:rPr>
+            </w:r>
+            <w:r>
+              <w:rPr>
+                <w:sz w:val="18"/>
+              </w:rPr>
+              <w:t>1/2 (50%)</w:t>
+            </w:r>
+          </w:p>
+        </w:tc>
+        <w:tc>
+          <w:tcPr>
+            <w:tcW w:type="dxa" w:w="2351"/>
+          </w:tcPr>
+          <w:p>
+            <w:pPr>
+              <w:spacing w:after="40"/>
+            </w:pPr>
+            <w:r>
+              <w:rPr>
+                <w:sz w:val="18"/>
+              </w:rPr>
+            </w:r>
+            <w:r>
+              <w:rPr>
+                <w:b/>
+                <w:sz w:val="18"/>
+              </w:rPr>
+              <w:t>12/12 (100%)</w:t>
+            </w:r>
+          </w:p>
+        </w:tc>
+        <w:tc>
+          <w:tcPr>
+            <w:tcW w:type="dxa" w:w="2351"/>
+          </w:tcPr>
+          <w:p>
+            <w:pPr>
+              <w:spacing w:after="40"/>
+            </w:pPr>
+            <w:r>
+              <w:rPr>
+                <w:sz w:val="18"/>
+              </w:rPr>
+            </w:r>
+            <w:r>
+              <w:rPr>
+                <w:sz w:val="18"/>
+              </w:rPr>
+              <w:t>全胜</w:t>
+            </w:r>
+          </w:p>
+        </w:tc>
+      </w:tr>
+      <w:tr>
+        <w:tc>
+          <w:tcPr>
+            <w:tcW w:type="dxa" w:w="2351"/>
+          </w:tcPr>
+          <w:p>
+            <w:pPr>
+              <w:spacing w:after="40"/>
+            </w:pPr>
+            <w:r>
+              <w:rPr>
+                <w:sz w:val="18"/>
+              </w:rPr>
+            </w:r>
+            <w:r>
+              <w:rPr>
+                <w:sz w:val="18"/>
+              </w:rPr>
+              <w:t>训练集平均优势</w:t>
+            </w:r>
+          </w:p>
+        </w:tc>
+        <w:tc>
+          <w:tcPr>
+            <w:tcW w:type="dxa" w:w="2351"/>
+          </w:tcPr>
+          <w:p>
+            <w:pPr>
+              <w:spacing w:after="40"/>
+            </w:pPr>
+            <w:r>
+              <w:rPr>
+                <w:sz w:val="18"/>
+              </w:rPr>
+            </w:r>
+            <w:r>
+              <w:rPr>
+                <w:sz w:val="18"/>
+              </w:rPr>
+              <w:t>+0.003</w:t>
+            </w:r>
+          </w:p>
+        </w:tc>
+        <w:tc>
+          <w:tcPr>
+            <w:tcW w:type="dxa" w:w="2351"/>
+          </w:tcPr>
+          <w:p>
+            <w:pPr>
+              <w:spacing w:after="40"/>
+            </w:pPr>
+            <w:r>
+              <w:rPr>
+                <w:sz w:val="18"/>
+              </w:rPr>
+            </w:r>
+            <w:r>
+              <w:rPr>
+                <w:b/>
+                <w:sz w:val="18"/>
+              </w:rPr>
+              <w:t>+0.014</w:t>
+            </w:r>
+          </w:p>
+        </w:tc>
+        <w:tc>
+          <w:tcPr>
+            <w:tcW w:type="dxa" w:w="2351"/>
+          </w:tcPr>
+          <w:p>
+            <w:pPr>
+              <w:spacing w:after="40"/>
+            </w:pPr>
+            <w:r>
+              <w:rPr>
+                <w:sz w:val="18"/>
+              </w:rPr>
+            </w:r>
+            <w:r>
+              <w:rPr>
+                <w:sz w:val="18"/>
+              </w:rPr>
+              <w:t>4.7x</w:t>
+            </w:r>
+          </w:p>
+        </w:tc>
+      </w:tr>
+      <w:tr>
+        <w:tc>
+          <w:tcPr>
+            <w:tcW w:type="dxa" w:w="2351"/>
+          </w:tcPr>
+          <w:p>
+            <w:pPr>
+              <w:spacing w:after="40"/>
+            </w:pPr>
+            <w:r>
+              <w:rPr>
+                <w:sz w:val="18"/>
+              </w:rPr>
+            </w:r>
+            <w:r>
+              <w:rPr>
+                <w:sz w:val="18"/>
+              </w:rPr>
+              <w:t>云南 cos_sim</w:t>
+            </w:r>
+          </w:p>
+        </w:tc>
+        <w:tc>
+          <w:tcPr>
+            <w:tcW w:type="dxa" w:w="2351"/>
+          </w:tcPr>
+          <w:p>
+            <w:pPr>
+              <w:spacing w:after="40"/>
+            </w:pPr>
+            <w:r>
+              <w:rPr>
+                <w:sz w:val="18"/>
+              </w:rPr>
+            </w:r>
+            <w:r>
+              <w:rPr>
+                <w:sz w:val="18"/>
+              </w:rPr>
+              <w:t>0.756 (OOD崩溃)</w:t>
+            </w:r>
+          </w:p>
+        </w:tc>
+        <w:tc>
+          <w:tcPr>
+            <w:tcW w:type="dxa" w:w="2351"/>
+          </w:tcPr>
+          <w:p>
+            <w:pPr>
+              <w:spacing w:after="40"/>
+            </w:pPr>
+            <w:r>
+              <w:rPr>
+                <w:sz w:val="18"/>
+              </w:rPr>
+            </w:r>
+            <w:r>
+              <w:rPr>
+                <w:b/>
+                <w:sz w:val="18"/>
+              </w:rPr>
+              <w:t>0.969</w:t>
+            </w:r>
+            <w:r>
+              <w:rPr>
+                <w:sz w:val="18"/>
+              </w:rPr>
+              <w:t xml:space="preserve"> (训练区正常)</w:t>
+            </w:r>
+          </w:p>
+        </w:tc>
+        <w:tc>
+          <w:tcPr>
+            <w:tcW w:type="dxa" w:w="2351"/>
+          </w:tcPr>
+          <w:p>
+            <w:pPr>
+              <w:spacing w:after="40"/>
+            </w:pPr>
+            <w:r>
+              <w:rPr>
+                <w:sz w:val="18"/>
+              </w:rPr>
+            </w:r>
+            <w:r>
+              <w:rPr>
+                <w:sz w:val="18"/>
+              </w:rPr>
+              <w:t>完全恢复</w:t>
+            </w:r>
+          </w:p>
+        </w:tc>
+      </w:tr>
+      <w:tr>
+        <w:tc>
+          <w:tcPr>
+            <w:tcW w:type="dxa" w:w="2351"/>
+          </w:tcPr>
+          <w:p>
+            <w:pPr>
+              <w:spacing w:after="40"/>
+            </w:pPr>
+            <w:r>
+              <w:rPr>
+                <w:sz w:val="18"/>
+              </w:rPr>
+            </w:r>
+            <w:r>
+              <w:rPr>
+                <w:sz w:val="18"/>
+              </w:rPr>
+              <w:t>OOD 平均差距</w:t>
+            </w:r>
+          </w:p>
+        </w:tc>
+        <w:tc>
+          <w:tcPr>
+            <w:tcW w:type="dxa" w:w="2351"/>
+          </w:tcPr>
+          <w:p>
+            <w:pPr>
+              <w:spacing w:after="40"/>
+            </w:pPr>
+            <w:r>
+              <w:rPr>
+                <w:sz w:val="18"/>
+              </w:rPr>
+            </w:r>
+            <w:r>
+              <w:rPr>
+                <w:sz w:val="18"/>
+              </w:rPr>
+              <w:t>-0.195</w:t>
+            </w:r>
+          </w:p>
+        </w:tc>
+        <w:tc>
+          <w:tcPr>
+            <w:tcW w:type="dxa" w:w="2351"/>
+          </w:tcPr>
+          <w:p>
+            <w:pPr>
+              <w:spacing w:after="40"/>
+            </w:pPr>
+            <w:r>
+              <w:rPr>
+                <w:sz w:val="18"/>
+              </w:rPr>
+            </w:r>
+            <w:r>
+              <w:rPr>
+                <w:b/>
+                <w:sz w:val="18"/>
+              </w:rPr>
+              <w:t>-0.075</w:t>
+            </w:r>
+          </w:p>
+        </w:tc>
+        <w:tc>
+          <w:tcPr>
+            <w:tcW w:type="dxa" w:w="2351"/>
+          </w:tcPr>
+          <w:p>
+            <w:pPr>
+              <w:spacing w:after="40"/>
+            </w:pPr>
+            <w:r>
+              <w:rPr>
+                <w:sz w:val="18"/>
+              </w:rPr>
+            </w:r>
+            <w:r>
+              <w:rPr>
+                <w:sz w:val="18"/>
+              </w:rPr>
+              <w:t>缩小 61%</w:t>
+            </w:r>
+          </w:p>
+        </w:tc>
+      </w:tr>
+    </w:tbl>
+    <w:p>
+      <w:pPr>
+        <w:pStyle w:val="Heading4"/>
+      </w:pPr>
+      <w:r>
+        <w:rPr>
+          <w:rFonts w:ascii="Calibri" w:hAnsi="Calibri"/>
+          <w:color w:val="1A1A2E"/>
+        </w:rPr>
+        <w:t>分析</w:t>
+      </w:r>
+    </w:p>
+    <w:p>
+      <w:pPr>
+        <w:pStyle w:val="ListBullet"/>
+      </w:pPr>
+      <w:r>
+        <w:t xml:space="preserve">1. </w:t>
+      </w:r>
+      <w:r>
+        <w:rPr>
+          <w:b/>
+        </w:rPr>
+        <w:t>数据量是第一生产力</w:t>
+      </w:r>
+      <w:r>
+        <w:t>：仅将训练区域从 2 扩展到 12，模型在所有训练区域上都超越了持续性基线，最大优势在青海边缘达 +0.084。</w:t>
+      </w:r>
+    </w:p>
+    <w:p>
+      <w:r>
+        <w:t xml:space="preserve">2. </w:t>
+      </w:r>
+      <w:r>
+        <w:rPr>
+          <w:b/>
+        </w:rPr>
+        <w:t>验证集表现合理</w:t>
+      </w:r>
+      <w:r>
+        <w:t>：珠三角（+0.001）几乎持平，鄱阳湖（-0.014）略差——这两个区域的土地类型与训练集有重叠，但具体变化模式不同。</w:t>
+      </w:r>
+    </w:p>
+    <w:p>
+      <w:r>
+        <w:t xml:space="preserve">3. </w:t>
+      </w:r>
+      <w:r>
+        <w:rPr>
+          <w:b/>
+        </w:rPr>
+        <w:t>OOD 仍有差距</w:t>
+      </w:r>
+      <w:r>
+        <w:t>：三峡水库差距小（-0.014），因为其混合类型在训练集中有覆盖。拉萨河谷差距大（-0.137），因为高原/极端气候区域在训练集中完全没有代表。</w:t>
+      </w:r>
+    </w:p>
+    <w:p>
+      <w:r>
+        <w:t xml:space="preserve">4. </w:t>
+      </w:r>
+      <w:r>
+        <w:rPr>
+          <w:b/>
+        </w:rPr>
+        <w:t>线性外推始终最差</w:t>
+      </w:r>
+      <w:r>
+        <w:t>：在所有区域上，线性外推都远差于模型和持续性，确认了土地利用变化的非线性本质。</w:t>
+      </w:r>
+    </w:p>
     <w:p>
       <w:pPr>
         <w:pStyle w:val="Heading2"/>

</xml_diff>